<commit_message>
Presentation: implementation and run-log slides, appendix, per-run log
- Deck: new Implementation slide (model, agent, runner, phone) and two run-log
  slides in the course log format (D1 p.49), one row per run with links to the
  trajectory logs. Three supporting slides (actions/observation, steps vs
  reference, speed and cost) move to an appendix after the Thank-you slide;
  26 slides are presented, about 22 min of speech plus 2 min of video.
- docs/RUN_LOG.md and presentation/Run_Log_Final_Evaluation.docx: one card per
  task, the three runs side by side, with note, recording clips, trajectory
  link and agent version (generated from presentation/run_log_data.py).
- Team briefing and Q&A updated to the new slide order.

Co-Authored-By: Claude Opus 5.5 <noreply@anthropic.com>
</commit_message>
<xml_diff>
--- a/presentation/Team_Briefing_AndroidWorld_Agent.docx
+++ b/presentation/Team_Briefing_AndroidWorld_Agent.docx
@@ -3373,6 +3373,37 @@
               <w:rPr>
                 <w:sz w:val="19"/>
               </w:rPr>
+              <w:t>Run log: one card per run (course log fields, note, recording, trajectory link)</w:t>
+            </w:r>
+          </w:p>
+        </w:tc>
+        <w:tc>
+          <w:tcPr>
+            <w:tcW w:type="dxa" w:w="6236"/>
+          </w:tcPr>
+          <w:p>
+            <w:r/>
+            <w:r>
+              <w:rPr>
+                <w:sz w:val="19"/>
+              </w:rPr>
+              <w:t>docs/RUN_LOG.md, and Run_Log_Final_Evaluation.docx in presentation/</w:t>
+            </w:r>
+          </w:p>
+        </w:tc>
+      </w:tr>
+      <w:tr>
+        <w:tc>
+          <w:tcPr>
+            <w:tcW w:type="dxa" w:w="3175"/>
+            <w:shd w:val="clear" w:color="auto" w:fill="F2F5F9"/>
+          </w:tcPr>
+          <w:p>
+            <w:r/>
+            <w:r>
+              <w:rPr>
+                <w:sz w:val="19"/>
+              </w:rPr>
               <w:t>Presentation, script, Q&amp;A</w:t>
             </w:r>
           </w:p>
@@ -3380,6 +3411,7 @@
         <w:tc>
           <w:tcPr>
             <w:tcW w:type="dxa" w:w="6236"/>
+            <w:shd w:val="clear" w:color="auto" w:fill="F2F5F9"/>
           </w:tcPr>
           <w:p>
             <w:r/>
@@ -3396,7 +3428,6 @@
         <w:tc>
           <w:tcPr>
             <w:tcW w:type="dxa" w:w="3175"/>
-            <w:shd w:val="clear" w:color="auto" w:fill="F2F5F9"/>
           </w:tcPr>
           <w:p>
             <w:r/>
@@ -3411,7 +3442,6 @@
         <w:tc>
           <w:tcPr>
             <w:tcW w:type="dxa" w:w="6236"/>
-            <w:shd w:val="clear" w:color="auto" w:fill="F2F5F9"/>
           </w:tcPr>
           <w:p>
             <w:r/>
@@ -3451,7 +3481,7 @@
         <w:rPr>
           <w:i w:val="0"/>
         </w:rPr>
-        <w:t>For each slide: what it says, where its numbers come from, the words a newcomer may not know, and a likely question. The spoken script for each slide is in the slide notes and in SCRIPT.md.</w:t>
+        <w:t>For each slide: what it says, where its numbers come from, the words a newcomer may not know, and a likely question. The spoken script for each slide is in the slide notes and in SCRIPT.md. We present slides 1 to 26 (about 22 minutes of speaking plus 2 minutes of video). Slides 27 to 29 are an appendix after the Thank-you slide: they stay in the file and we only open them if a question needs them.</w:t>
       </w:r>
     </w:p>
     <w:p>
@@ -3670,7 +3700,7 @@
         <w:t xml:space="preserve">Extra inputs disclosed: </w:t>
       </w:r>
       <w:r>
-        <w:t>two tasks received screen labels in addition to the screenshot, and we say so (slide 7).</w:t>
+        <w:t>two tasks received screen labels in addition to the screenshot, and we say so (slides 6, 13–14 and appendix slide 27).</w:t>
       </w:r>
     </w:p>
     <w:p>
@@ -4137,7 +4167,7 @@
         <w:t xml:space="preserve">Check: </w:t>
       </w:r>
       <w:r>
-        <w:t>our code validates the model's action before the phone sees it (slide 9).</w:t>
+        <w:t>our code validates the model's action before the phone sees it (slide 8).</w:t>
       </w:r>
     </w:p>
     <w:p>
@@ -4177,7 +4207,7 @@
         <w:pStyle w:val="Heading2"/>
       </w:pPr>
       <w:r>
-        <w:t>Slide 7: Actions and observation</w:t>
+        <w:t>Slide 7: Context and Skills</w:t>
       </w:r>
     </w:p>
     <w:p>
@@ -4194,7 +4224,7 @@
         <w:rPr>
           <w:i w:val="0"/>
         </w:rPr>
-        <w:t>The seven actions the model may use, with real examples, and what the agent sees in each task.</w:t>
+        <w:t>What goes into each model request, and the two Skills.</w:t>
       </w:r>
     </w:p>
     <w:p>
@@ -4222,6 +4252,1914 @@
         <w:rPr>
           <w:b/>
         </w:rPr>
+        <w:t xml:space="preserve">Every request: </w:t>
+      </w:r>
+      <w:r>
+        <w:t>action rules, a completion rule (what done looks like), the last 20 steps, the newest screenshot, a short status.</w:t>
+      </w:r>
+    </w:p>
+    <w:p>
+      <w:pPr>
+        <w:pStyle w:val="ListBullet"/>
+        <w:spacing w:after="40"/>
+      </w:pPr>
+      <w:r>
+        <w:rPr>
+          <w:b/>
+        </w:rPr>
+        <w:t xml:space="preserve">Markor Skill (text): </w:t>
+      </w:r>
+      <w:r>
+        <w:t>built from the Markor failure analysis: never use Markor's Share menu; type the text into a new plain SMS.</w:t>
+      </w:r>
+    </w:p>
+    <w:p>
+      <w:pPr>
+        <w:pStyle w:val="ListBullet"/>
+        <w:spacing w:after="40"/>
+      </w:pPr>
+      <w:r>
+        <w:rPr>
+          <w:b/>
+        </w:rPr>
+        <w:t xml:space="preserve">OsmAnd Skill (code): </w:t>
+      </w:r>
+      <w:r>
+        <w:t>recognises the screen from the GUI tree and states the next step and its tap centre.</w:t>
+      </w:r>
+    </w:p>
+    <w:p>
+      <w:pPr>
+        <w:spacing w:after="120"/>
+      </w:pPr>
+      <w:r>
+        <w:rPr>
+          <w:b/>
+        </w:rPr>
+        <w:t>Words on this slide</w:t>
+      </w:r>
+      <w:r>
+        <w:rPr>
+          <w:i w:val="0"/>
+        </w:rPr>
+      </w:r>
+    </w:p>
+    <w:p>
+      <w:pPr>
+        <w:pStyle w:val="ListBullet"/>
+        <w:spacing w:after="40"/>
+      </w:pPr>
+      <w:r>
+        <w:rPr>
+          <w:b/>
+        </w:rPr>
+        <w:t xml:space="preserve">Completion rule: </w:t>
+      </w:r>
+      <w:r>
+        <w:t>one sentence per task, for example “the saved contact view shows the exact name and number; a filled form is not enough”.</w:t>
+      </w:r>
+    </w:p>
+    <w:p>
+      <w:pPr>
+        <w:spacing w:after="120"/>
+      </w:pPr>
+      <w:r>
+        <w:rPr>
+          <w:b/>
+        </w:rPr>
+        <w:t xml:space="preserve">If someone asks: </w:t>
+      </w:r>
+      <w:r>
+        <w:rPr>
+          <w:i/>
+        </w:rPr>
+        <w:t>Is the OsmAnd Skill a script? It suggests, the model decides and acts, and it sometimes ignored the suggestion. It only works for OsmAnd.</w:t>
+      </w:r>
+    </w:p>
+    <w:p>
+      <w:pPr>
+        <w:pStyle w:val="Heading2"/>
+      </w:pPr>
+      <w:r>
+        <w:t>Slide 8: Safety net</w:t>
+      </w:r>
+    </w:p>
+    <w:p>
+      <w:pPr>
+        <w:spacing w:after="120"/>
+      </w:pPr>
+      <w:r>
+        <w:rPr>
+          <w:b/>
+        </w:rPr>
+        <w:t xml:space="preserve">What it says. </w:t>
+      </w:r>
+      <w:r>
+        <w:rPr>
+          <w:i w:val="0"/>
+        </w:rPr>
+        <w:t>Actions are checked before they reach the phone. Refused actions are not executed; the model gets the reason and one correction in the same step.</w:t>
+      </w:r>
+    </w:p>
+    <w:p>
+      <w:pPr>
+        <w:spacing w:after="120"/>
+      </w:pPr>
+      <w:r>
+        <w:rPr>
+          <w:b/>
+        </w:rPr>
+        <w:t>The data, and where it comes from</w:t>
+      </w:r>
+      <w:r>
+        <w:rPr>
+          <w:i w:val="0"/>
+        </w:rPr>
+      </w:r>
+    </w:p>
+    <w:p>
+      <w:pPr>
+        <w:pStyle w:val="ListBullet"/>
+        <w:spacing w:after="40"/>
+      </w:pPr>
+      <w:r>
+        <w:rPr>
+          <w:b/>
+        </w:rPr>
+        <w:t xml:space="preserve">8 refusals in the final runs, in 7 of 21 runs: </w:t>
+      </w:r>
+      <w:r>
+        <w:t>3 typing with no focused text field, 2 malformed replies, 1 unsupported action, 1 truncated reply, 1 OsmAnd favourite button.</w:t>
+      </w:r>
+    </w:p>
+    <w:p>
+      <w:pPr>
+        <w:pStyle w:val="ListBullet"/>
+        <w:spacing w:after="40"/>
+      </w:pPr>
+      <w:r>
+        <w:rPr>
+          <w:b/>
+        </w:rPr>
+        <w:t>6 of the 7 runs with a refusal still passed.</w:t>
+      </w:r>
+      <w:r/>
+    </w:p>
+    <w:p>
+      <w:pPr>
+        <w:spacing w:after="120"/>
+      </w:pPr>
+      <w:r>
+        <w:rPr>
+          <w:b/>
+        </w:rPr>
+        <w:t>Words on this slide</w:t>
+      </w:r>
+      <w:r>
+        <w:rPr>
+          <w:i w:val="0"/>
+        </w:rPr>
+      </w:r>
+    </w:p>
+    <w:p>
+      <w:pPr>
+        <w:pStyle w:val="ListBullet"/>
+        <w:spacing w:after="40"/>
+      </w:pPr>
+      <w:r>
+        <w:rPr>
+          <w:b/>
+        </w:rPr>
+        <w:t xml:space="preserve">Malformed reply: </w:t>
+      </w:r>
+      <w:r>
+        <w:t>the model did not give exactly one action.</w:t>
+      </w:r>
+    </w:p>
+    <w:p>
+      <w:pPr>
+        <w:pStyle w:val="ListBullet"/>
+        <w:spacing w:after="40"/>
+      </w:pPr>
+      <w:r>
+        <w:rPr>
+          <w:b/>
+        </w:rPr>
+        <w:t xml:space="preserve">Favourite button: </w:t>
+      </w:r>
+      <w:r>
+        <w:t>on an OsmAnd place card it saves a favourite, not a route point.</w:t>
+      </w:r>
+    </w:p>
+    <w:p>
+      <w:pPr>
+        <w:pStyle w:val="Heading2"/>
+      </w:pPr>
+      <w:r>
+        <w:t>Slide 9: Implementation</w:t>
+      </w:r>
+    </w:p>
+    <w:p>
+      <w:pPr>
+        <w:spacing w:after="120"/>
+      </w:pPr>
+      <w:r>
+        <w:rPr>
+          <w:b/>
+        </w:rPr>
+        <w:t xml:space="preserve">What it says. </w:t>
+      </w:r>
+      <w:r>
+        <w:rPr>
+          <w:i w:val="0"/>
+        </w:rPr>
+        <w:t>The four parts of the system and how they talk to each other, plus how we run, test and reproduce it.</w:t>
+      </w:r>
+    </w:p>
+    <w:p>
+      <w:pPr>
+        <w:spacing w:after="120"/>
+      </w:pPr>
+      <w:r>
+        <w:rPr>
+          <w:b/>
+        </w:rPr>
+        <w:t>The data, and where it comes from</w:t>
+      </w:r>
+      <w:r>
+        <w:rPr>
+          <w:i w:val="0"/>
+        </w:rPr>
+      </w:r>
+    </w:p>
+    <w:p>
+      <w:pPr>
+        <w:pStyle w:val="ListBullet"/>
+        <w:spacing w:after="40"/>
+      </w:pPr>
+      <w:r>
+        <w:rPr>
+          <w:b/>
+        </w:rPr>
+        <w:t xml:space="preserve">AutoGLM model: </w:t>
+      </w:r>
+      <w:r>
+        <w:t>runs on Z.ai's servers; we call it over HTTPS (model name autoglm-phone-multilingual). The API key is in a local .env file and never in git.</w:t>
+      </w:r>
+    </w:p>
+    <w:p>
+      <w:pPr>
+        <w:pStyle w:val="ListBullet"/>
+        <w:spacing w:after="40"/>
+      </w:pPr>
+      <w:r>
+        <w:rPr>
+          <w:b/>
+        </w:rPr>
+        <w:t xml:space="preserve">Agent: </w:t>
+      </w:r>
+      <w:r>
+        <w:t>the AutoGLMAgent class in autoglm_agent.py. Its step() builds the request (prompt, Skills, task settings), checks the answer and executes one action.</w:t>
+      </w:r>
+    </w:p>
+    <w:p>
+      <w:pPr>
+        <w:pStyle w:val="ListBullet"/>
+        <w:spacing w:after="40"/>
+      </w:pPr>
+      <w:r>
+        <w:rPr>
+          <w:b/>
+        </w:rPr>
+        <w:t xml:space="preserve">Runner: </w:t>
+      </w:r>
+      <w:r>
+        <w:t>run_task.py sets up the task from its seed, starts the screen recorder, calls step() until the run ends, asks the verifier and writes the logs.</w:t>
+      </w:r>
+    </w:p>
+    <w:p>
+      <w:pPr>
+        <w:pStyle w:val="ListBullet"/>
+        <w:spacing w:after="40"/>
+      </w:pPr>
+      <w:r>
+        <w:rPr>
+          <w:b/>
+        </w:rPr>
+        <w:t xml:space="preserve">Phone: </w:t>
+      </w:r>
+      <w:r>
+        <w:t>an Android emulator (Pixel 6, Android 13) without a window. AndroidWorld talks to it over adb to read the screen and to tap and type, and it provides the task setup and the verifier.</w:t>
+      </w:r>
+    </w:p>
+    <w:p>
+      <w:pPr>
+        <w:pStyle w:val="ListBullet"/>
+        <w:spacing w:after="40"/>
+      </w:pPr>
+      <w:r>
+        <w:rPr>
+          <w:b/>
+        </w:rPr>
+        <w:t xml:space="preserve">Batch evaluation: </w:t>
+      </w:r>
+      <w:r>
+        <w:t>evaluate_tasks.py runs tasks × seeds, writes a fingerprint of the source files into every run, and stops if the code changes during a batch.</w:t>
+      </w:r>
+    </w:p>
+    <w:p>
+      <w:pPr>
+        <w:pStyle w:val="ListBullet"/>
+        <w:spacing w:after="40"/>
+      </w:pPr>
+      <w:r>
+        <w:rPr>
+          <w:b/>
+        </w:rPr>
+        <w:t xml:space="preserve">Reproduce: </w:t>
+      </w:r>
+      <w:r>
+        <w:t>check out the tag team-agent-final-v65 and run evaluate_tasks.py with the seven tasks and seeds 42 43 44 (OsmAnd 31 314 366) and --run-all-seeds. Python 3.11 on a Windows laptop, no GPU needed.</w:t>
+      </w:r>
+    </w:p>
+    <w:p>
+      <w:pPr>
+        <w:spacing w:after="120"/>
+      </w:pPr>
+      <w:r>
+        <w:rPr>
+          <w:b/>
+        </w:rPr>
+        <w:t>Words on this slide</w:t>
+      </w:r>
+      <w:r>
+        <w:rPr>
+          <w:i w:val="0"/>
+        </w:rPr>
+      </w:r>
+    </w:p>
+    <w:p>
+      <w:pPr>
+        <w:pStyle w:val="ListBullet"/>
+        <w:spacing w:after="40"/>
+      </w:pPr>
+      <w:r>
+        <w:rPr>
+          <w:b/>
+        </w:rPr>
+        <w:t xml:space="preserve">adb: </w:t>
+      </w:r>
+      <w:r>
+        <w:t>Android Debug Bridge, the standard tool a computer uses to control an Android phone or emulator.</w:t>
+      </w:r>
+    </w:p>
+    <w:p>
+      <w:pPr>
+        <w:pStyle w:val="ListBullet"/>
+        <w:spacing w:after="40"/>
+      </w:pPr>
+      <w:r>
+        <w:rPr>
+          <w:b/>
+        </w:rPr>
+        <w:t xml:space="preserve">Headless: </w:t>
+      </w:r>
+      <w:r>
+        <w:t>the emulator runs without showing a window; the recorder still films its screen.</w:t>
+      </w:r>
+    </w:p>
+    <w:p>
+      <w:pPr>
+        <w:pStyle w:val="ListBullet"/>
+        <w:spacing w:after="40"/>
+      </w:pPr>
+      <w:r>
+        <w:rPr>
+          <w:b/>
+        </w:rPr>
+        <w:t xml:space="preserve">Source fingerprint: </w:t>
+      </w:r>
+      <w:r>
+        <w:t>hashes of the agent's files; equal fingerprints prove two runs used the same code.</w:t>
+      </w:r>
+    </w:p>
+    <w:p>
+      <w:pPr>
+        <w:spacing w:after="120"/>
+      </w:pPr>
+      <w:r>
+        <w:rPr>
+          <w:b/>
+        </w:rPr>
+        <w:t xml:space="preserve">If someone asks: </w:t>
+      </w:r>
+      <w:r>
+        <w:rPr>
+          <w:i/>
+        </w:rPr>
+        <w:t>Where is the loop? The runner calls step() again and again; each call does observe, decide, check, act, record (slide 6).</w:t>
+      </w:r>
+    </w:p>
+    <w:p>
+      <w:pPr>
+        <w:pStyle w:val="Heading2"/>
+      </w:pPr>
+      <w:r>
+        <w:t>Slide 10: One run step by step</w:t>
+      </w:r>
+    </w:p>
+    <w:p>
+      <w:pPr>
+        <w:spacing w:after="120"/>
+      </w:pPr>
+      <w:r>
+        <w:rPr>
+          <w:b/>
+        </w:rPr>
+        <w:t xml:space="preserve">What it says. </w:t>
+      </w:r>
+      <w:r>
+        <w:rPr>
+          <w:i w:val="0"/>
+        </w:rPr>
+        <w:t>Markor with seed 44 (15 steps, PASS): six screenshots and, under each, a sentence from the model's own reasoning in the log.</w:t>
+      </w:r>
+    </w:p>
+    <w:p>
+      <w:pPr>
+        <w:spacing w:after="120"/>
+      </w:pPr>
+      <w:r>
+        <w:rPr>
+          <w:b/>
+        </w:rPr>
+        <w:t>The data, and where it comes from</w:t>
+      </w:r>
+      <w:r>
+        <w:rPr>
+          <w:i w:val="0"/>
+        </w:rPr>
+      </w:r>
+    </w:p>
+    <w:p>
+      <w:pPr>
+        <w:pStyle w:val="ListBullet"/>
+        <w:spacing w:after="40"/>
+      </w:pPr>
+      <w:r>
+        <w:t>Steps 2, 4, 8, 10, 14 and 15 of run trial_MarkorCreateNoteAndSms_20261008T222633_440045Z.</w:t>
+      </w:r>
+    </w:p>
+    <w:p>
+      <w:pPr>
+        <w:spacing w:after="120"/>
+      </w:pPr>
+      <w:r>
+        <w:rPr>
+          <w:b/>
+        </w:rPr>
+        <w:t xml:space="preserve">If someone asks: </w:t>
+      </w:r>
+      <w:r>
+        <w:rPr>
+          <w:i/>
+        </w:rPr>
+        <w:t>Did the model really write these sentences? Yes, they are verbatim from its replies in the trajectory log.</w:t>
+      </w:r>
+    </w:p>
+    <w:p>
+      <w:pPr>
+        <w:pStyle w:val="Heading2"/>
+      </w:pPr>
+      <w:r>
+        <w:t>Slide 11: How we tested</w:t>
+      </w:r>
+    </w:p>
+    <w:p>
+      <w:pPr>
+        <w:spacing w:after="120"/>
+      </w:pPr>
+      <w:r>
+        <w:rPr>
+          <w:b/>
+        </w:rPr>
+        <w:t xml:space="preserve">What it says. </w:t>
+      </w:r>
+      <w:r>
+        <w:rPr>
+          <w:i w:val="0"/>
+        </w:rPr>
+        <w:t>One frozen version, three runs per task, the official verifier, and one log row per run in the course's format.</w:t>
+      </w:r>
+    </w:p>
+    <w:p>
+      <w:pPr>
+        <w:spacing w:after="120"/>
+      </w:pPr>
+      <w:r>
+        <w:rPr>
+          <w:b/>
+        </w:rPr>
+        <w:t>The data, and where it comes from</w:t>
+      </w:r>
+      <w:r>
+        <w:rPr>
+          <w:i w:val="0"/>
+        </w:rPr>
+      </w:r>
+    </w:p>
+    <w:p>
+      <w:pPr>
+        <w:pStyle w:val="ListBullet"/>
+        <w:spacing w:after="40"/>
+      </w:pPr>
+      <w:r>
+        <w:rPr>
+          <w:b/>
+        </w:rPr>
+        <w:t xml:space="preserve">Tag team-agent-final-v65: </w:t>
+      </w:r>
+      <w:r>
+        <w:t>both batches recorded the same source fingerprint (hashes of the agent's files).</w:t>
+      </w:r>
+    </w:p>
+    <w:p>
+      <w:pPr>
+        <w:pStyle w:val="ListBullet"/>
+        <w:spacing w:after="40"/>
+      </w:pPr>
+      <w:r>
+        <w:rPr>
+          <w:b/>
+        </w:rPr>
+        <w:t xml:space="preserve">Seeds 42, 43, 44 for six tasks; 31, 314, 366 for OsmAnd: </w:t>
+      </w:r>
+      <w:r>
+        <w:t>these three OsmAnd seeds all produce the slide's route.</w:t>
+      </w:r>
+    </w:p>
+    <w:p>
+      <w:pPr>
+        <w:pStyle w:val="ListBullet"/>
+        <w:spacing w:after="40"/>
+      </w:pPr>
+      <w:r>
+        <w:rPr>
+          <w:b/>
+        </w:rPr>
+        <w:t xml:space="preserve">Step budgets: </w:t>
+      </w:r>
+      <w:r>
+        <w:t>about 2 to 4 times the reference steps (Wi-Fi 12, Contacts 16, SMS 20, Files 25, Calendar 35, Markor 40, OsmAnd 90).</w:t>
+      </w:r>
+    </w:p>
+    <w:p>
+      <w:pPr>
+        <w:pStyle w:val="ListBullet"/>
+        <w:spacing w:after="40"/>
+      </w:pPr>
+      <w:r>
+        <w:rPr>
+          <w:b/>
+        </w:rPr>
+        <w:t xml:space="preserve">Three boxes: </w:t>
+      </w:r>
+      <w:r>
+        <w:t>what we keep for every one of the 21 runs: a summary row in the course's log fields (D1 p.49), written by the runner during the run; the trajectory log (every screenshot, model reply, check and result); and the screen recording. The full log follows on slides 13 and 14.</w:t>
+      </w:r>
+    </w:p>
+    <w:p>
+      <w:pPr>
+        <w:spacing w:after="120"/>
+      </w:pPr>
+      <w:r>
+        <w:rPr>
+          <w:b/>
+        </w:rPr>
+        <w:t xml:space="preserve">If someone asks: </w:t>
+      </w:r>
+      <w:r>
+        <w:rPr>
+          <w:i/>
+        </w:rPr>
+        <w:t>Why not rerun failures? Rerunning the same code until it passes only measures luck.</w:t>
+      </w:r>
+    </w:p>
+    <w:p>
+      <w:pPr>
+        <w:pStyle w:val="Heading2"/>
+      </w:pPr>
+      <w:r>
+        <w:t>Slide 12: Results</w:t>
+      </w:r>
+    </w:p>
+    <w:p>
+      <w:pPr>
+        <w:spacing w:after="120"/>
+      </w:pPr>
+      <w:r>
+        <w:rPr>
+          <w:b/>
+        </w:rPr>
+        <w:t xml:space="preserve">What it says. </w:t>
+      </w:r>
+      <w:r>
+        <w:rPr>
+          <w:i w:val="0"/>
+        </w:rPr>
+        <w:t>All 21 runs: blue PASS, orange FAIL with its failure class.</w:t>
+      </w:r>
+    </w:p>
+    <w:p>
+      <w:pPr>
+        <w:spacing w:after="120"/>
+      </w:pPr>
+      <w:r>
+        <w:rPr>
+          <w:b/>
+        </w:rPr>
+        <w:t>The data, and where it comes from</w:t>
+      </w:r>
+      <w:r>
+        <w:rPr>
+          <w:i w:val="0"/>
+        </w:rPr>
+      </w:r>
+    </w:p>
+    <w:p>
+      <w:pPr>
+        <w:pStyle w:val="ListBullet"/>
+        <w:spacing w:after="40"/>
+      </w:pPr>
+      <w:r>
+        <w:t>Wi-Fi, SMS, Calendar, Markor 3/3; Contacts, Files, OsmAnd 2/3. Hard tasks together 5/6.</w:t>
+      </w:r>
+    </w:p>
+    <w:p>
+      <w:pPr>
+        <w:pStyle w:val="ListBullet"/>
+        <w:spacing w:after="40"/>
+      </w:pPr>
+      <w:r>
+        <w:t>The “s” number in each cell is the task seed.</w:t>
+      </w:r>
+    </w:p>
+    <w:p>
+      <w:pPr>
+        <w:pStyle w:val="Heading2"/>
+      </w:pPr>
+      <w:r>
+        <w:t>Slide 13: Run log (1/2): one row per run</w:t>
+      </w:r>
+    </w:p>
+    <w:p>
+      <w:pPr>
+        <w:spacing w:after="120"/>
+      </w:pPr>
+      <w:r>
+        <w:rPr>
+          <w:b/>
+        </w:rPr>
+        <w:t xml:space="preserve">What it says. </w:t>
+      </w:r>
+      <w:r>
+        <w:rPr>
+          <w:i w:val="0"/>
+        </w:rPr>
+        <w:t>The course's run log (D1 p.49: “Friday's presentation is this table, sorted”), one row per run, sorted by task. This part has the five single-app tasks.</w:t>
+      </w:r>
+    </w:p>
+    <w:p>
+      <w:pPr>
+        <w:spacing w:after="120"/>
+      </w:pPr>
+      <w:r>
+        <w:rPr>
+          <w:b/>
+        </w:rPr>
+        <w:t>The data, and where it comes from</w:t>
+      </w:r>
+      <w:r>
+        <w:rPr>
+          <w:i w:val="0"/>
+        </w:rPr>
+      </w:r>
+    </w:p>
+    <w:p>
+      <w:pPr>
+        <w:pStyle w:val="ListBullet"/>
+        <w:spacing w:after="40"/>
+      </w:pPr>
+      <w:r>
+        <w:rPr>
+          <w:b/>
+        </w:rPr>
+        <w:t xml:space="preserve">Columns: </w:t>
+      </w:r>
+      <w:r>
+        <w:t>task, run (1 to 3), seed, observation, steps used / step budget, verifier result, failure class, number of video clips, and a short note.</w:t>
+      </w:r>
+    </w:p>
+    <w:p>
+      <w:pPr>
+        <w:pStyle w:val="ListBullet"/>
+        <w:spacing w:after="40"/>
+      </w:pPr>
+      <w:r>
+        <w:rPr>
+          <w:b/>
+        </w:rPr>
+        <w:t xml:space="preserve">Same for every run: </w:t>
+      </w:r>
+      <w:r>
+        <w:t>model AutoGLM-Phone-9B (Z.ai), version v65, grounding by coordinates. To save space they are in the grey line above the table.</w:t>
+      </w:r>
+    </w:p>
+    <w:p>
+      <w:pPr>
+        <w:pStyle w:val="ListBullet"/>
+        <w:spacing w:after="40"/>
+      </w:pPr>
+      <w:r>
+        <w:rPr>
+          <w:b/>
+        </w:rPr>
+        <w:t xml:space="preserve">Links: </w:t>
+      </w:r>
+      <w:r>
+        <w:t>each run number (“1 of 3”) opens that run's readable trajectory log on GitHub.</w:t>
+      </w:r>
+    </w:p>
+    <w:p>
+      <w:pPr>
+        <w:pStyle w:val="ListBullet"/>
+        <w:spacing w:after="40"/>
+      </w:pPr>
+      <w:r>
+        <w:rPr>
+          <w:b/>
+        </w:rPr>
+        <w:t xml:space="preserve">Clips: </w:t>
+      </w:r>
+      <w:r>
+        <w:t>Android's screen recorder stops after 180 seconds, so the runner starts a new clip; longer runs have 2 to 4 clips.</w:t>
+      </w:r>
+    </w:p>
+    <w:p>
+      <w:pPr>
+        <w:pStyle w:val="ListBullet"/>
+        <w:spacing w:after="40"/>
+      </w:pPr>
+      <w:r>
+        <w:rPr>
+          <w:b/>
+        </w:rPr>
+        <w:t xml:space="preserve">Orange rows: </w:t>
+      </w:r>
+      <w:r>
+        <w:t>the two failures here, Contacts s43 (other: navigation) and Files s43 (false_done).</w:t>
+      </w:r>
+    </w:p>
+    <w:p>
+      <w:pPr>
+        <w:pStyle w:val="ListBullet"/>
+        <w:spacing w:after="40"/>
+      </w:pPr>
+      <w:r>
+        <w:rPr>
+          <w:b/>
+        </w:rPr>
+        <w:t xml:space="preserve">Source: </w:t>
+      </w:r>
+      <w:r>
+        <w:t>the rows come from each run's summary.json, written by the runner while the run happened.</w:t>
+      </w:r>
+    </w:p>
+    <w:p>
+      <w:pPr>
+        <w:spacing w:after="120"/>
+      </w:pPr>
+      <w:r>
+        <w:rPr>
+          <w:b/>
+        </w:rPr>
+        <w:t>Words on this slide</w:t>
+      </w:r>
+      <w:r>
+        <w:rPr>
+          <w:i w:val="0"/>
+        </w:rPr>
+      </w:r>
+    </w:p>
+    <w:p>
+      <w:pPr>
+        <w:pStyle w:val="ListBullet"/>
+        <w:spacing w:after="40"/>
+      </w:pPr>
+      <w:r>
+        <w:rPr>
+          <w:b/>
+        </w:rPr>
+        <w:t xml:space="preserve">Chinese app name: </w:t>
+      </w:r>
+      <w:r>
+        <w:t>the model sometimes wrote the app name in Chinese; with one allowed app the runner can still resolve it.</w:t>
+      </w:r>
+    </w:p>
+    <w:p>
+      <w:pPr>
+        <w:spacing w:after="120"/>
+      </w:pPr>
+      <w:r>
+        <w:rPr>
+          <w:b/>
+        </w:rPr>
+        <w:t xml:space="preserve">If someone asks: </w:t>
+      </w:r>
+      <w:r>
+        <w:rPr>
+          <w:i/>
+        </w:rPr>
+        <w:t>Where are the videos? Not in git because of their size. Every clip is in team_agent_final_recordings_v65.zip, in a folder named after the run ID. docs/RUN_LOG.md lists each run with its clips and log link.</w:t>
+      </w:r>
+    </w:p>
+    <w:p>
+      <w:pPr>
+        <w:pStyle w:val="Heading2"/>
+      </w:pPr>
+      <w:r>
+        <w:t>Slide 14: Run log (2/2): the two multi-app tasks</w:t>
+      </w:r>
+    </w:p>
+    <w:p>
+      <w:pPr>
+        <w:spacing w:after="120"/>
+      </w:pPr>
+      <w:r>
+        <w:rPr>
+          <w:b/>
+        </w:rPr>
+        <w:t xml:space="preserve">What it says. </w:t>
+      </w:r>
+      <w:r>
+        <w:rPr>
+          <w:i w:val="0"/>
+        </w:rPr>
+        <w:t>The same table for Markor + SMS and OsmAnd, with longer notes because these runs have more going on.</w:t>
+      </w:r>
+    </w:p>
+    <w:p>
+      <w:pPr>
+        <w:spacing w:after="120"/>
+      </w:pPr>
+      <w:r>
+        <w:rPr>
+          <w:b/>
+        </w:rPr>
+        <w:t>The data, and where it comes from</w:t>
+      </w:r>
+      <w:r>
+        <w:rPr>
+          <w:i w:val="0"/>
+        </w:rPr>
+      </w:r>
+    </w:p>
+    <w:p>
+      <w:pPr>
+        <w:pStyle w:val="ListBullet"/>
+        <w:spacing w:after="40"/>
+      </w:pPr>
+      <w:r>
+        <w:t>Markor: all three runs followed the Skill (save the note, then send the same text as a plain SMS); run 1 needed the alias table for a Chinese app name; run 2 had one truncated reply that was retried.</w:t>
+      </w:r>
+    </w:p>
+    <w:p>
+      <w:pPr>
+        <w:pStyle w:val="ListBullet"/>
+        <w:spacing w:after="40"/>
+      </w:pPr>
+      <w:r>
+        <w:t>OsmAnd run 1: the runner first restored the map, because the Files runs had cleared shared storage. Runs 1 and 2 passed in 22 and 23 steps of 90.</w:t>
+      </w:r>
+    </w:p>
+    <w:p>
+      <w:pPr>
+        <w:pStyle w:val="ListBullet"/>
+        <w:spacing w:after="40"/>
+      </w:pPr>
+      <w:r>
+        <w:t>OsmAnd run 3 (FAIL, grounding): Ruggell became route point 1, then the model tapped Clear at [941, 57] instead of [941, 83] three times. Analysed on slide 19.</w:t>
+      </w:r>
+    </w:p>
+    <w:p>
+      <w:pPr>
+        <w:spacing w:after="120"/>
+      </w:pPr>
+      <w:r>
+        <w:rPr>
+          <w:b/>
+        </w:rPr>
+        <w:t>Words on this slide</w:t>
+      </w:r>
+      <w:r>
+        <w:rPr>
+          <w:i w:val="0"/>
+        </w:rPr>
+      </w:r>
+    </w:p>
+    <w:p>
+      <w:pPr>
+        <w:pStyle w:val="ListBullet"/>
+        <w:spacing w:after="40"/>
+      </w:pPr>
+      <w:r>
+        <w:rPr>
+          <w:b/>
+        </w:rPr>
+        <w:t xml:space="preserve">Alias table: </w:t>
+      </w:r>
+      <w:r>
+        <w:t>a small list in our code that maps other names of an app (for example Chinese ones) to the real app.</w:t>
+      </w:r>
+    </w:p>
+    <w:p>
+      <w:pPr>
+        <w:pStyle w:val="Heading2"/>
+      </w:pPr>
+      <w:r>
+        <w:t>Slide 15: Demo: all 21 runs</w:t>
+      </w:r>
+    </w:p>
+    <w:p>
+      <w:pPr>
+        <w:spacing w:after="120"/>
+      </w:pPr>
+      <w:r>
+        <w:rPr>
+          <w:b/>
+        </w:rPr>
+        <w:t xml:space="preserve">What it says. </w:t>
+      </w:r>
+      <w:r>
+        <w:rPr>
+          <w:i w:val="0"/>
+        </w:rPr>
+        <w:t>One video with all 21 final runs at once. Columns are tasks, rows are runs.</w:t>
+      </w:r>
+    </w:p>
+    <w:p>
+      <w:pPr>
+        <w:spacing w:after="120"/>
+      </w:pPr>
+      <w:r>
+        <w:rPr>
+          <w:b/>
+        </w:rPr>
+        <w:t>The data, and where it comes from</w:t>
+      </w:r>
+      <w:r>
+        <w:rPr>
+          <w:i w:val="0"/>
+        </w:rPr>
+      </w:r>
+    </w:p>
+    <w:p>
+      <w:pPr>
+        <w:pStyle w:val="ListBullet"/>
+        <w:spacing w:after="40"/>
+      </w:pPr>
+      <w:r>
+        <w:t>Each clip is sped up so that all end within 45 seconds; the label shows the speed (x2 = twice as fast) and PASS/FAIL.</w:t>
+      </w:r>
+    </w:p>
+    <w:p>
+      <w:pPr>
+        <w:pStyle w:val="ListBullet"/>
+        <w:spacing w:after="40"/>
+      </w:pPr>
+      <w:r>
+        <w:t>Each clip stops on its final screen. Orange labels mark the three failures.</w:t>
+      </w:r>
+    </w:p>
+    <w:p>
+      <w:pPr>
+        <w:spacing w:after="120"/>
+      </w:pPr>
+      <w:r>
+        <w:rPr>
+          <w:b/>
+        </w:rPr>
+        <w:t>Words on this slide</w:t>
+      </w:r>
+      <w:r>
+        <w:rPr>
+          <w:i w:val="0"/>
+        </w:rPr>
+      </w:r>
+    </w:p>
+    <w:p>
+      <w:pPr>
+        <w:pStyle w:val="ListBullet"/>
+        <w:spacing w:after="40"/>
+      </w:pPr>
+      <w:r>
+        <w:rPr>
+          <w:b/>
+        </w:rPr>
+        <w:t xml:space="preserve">Embedded video: </w:t>
+      </w:r>
+      <w:r>
+        <w:t>the video is inside the PowerPoint file; click it to play.</w:t>
+      </w:r>
+    </w:p>
+    <w:p>
+      <w:pPr>
+        <w:pStyle w:val="Heading2"/>
+      </w:pPr>
+      <w:r>
+        <w:t>Slide 16: Demo: one success, one failure</w:t>
+      </w:r>
+    </w:p>
+    <w:p>
+      <w:pPr>
+        <w:spacing w:after="120"/>
+      </w:pPr>
+      <w:r>
+        <w:rPr>
+          <w:b/>
+        </w:rPr>
+        <w:t xml:space="preserve">What it says. </w:t>
+      </w:r>
+      <w:r>
+        <w:rPr>
+          <w:i w:val="0"/>
+        </w:rPr>
+        <w:t>Markor seed 44 at 4x speed (PASS) and Files seed 43 at 3x speed (FAIL).</w:t>
+      </w:r>
+    </w:p>
+    <w:p>
+      <w:pPr>
+        <w:spacing w:after="120"/>
+      </w:pPr>
+      <w:r>
+        <w:rPr>
+          <w:b/>
+        </w:rPr>
+        <w:t>The data, and where it comes from</w:t>
+      </w:r>
+      <w:r>
+        <w:rPr>
+          <w:i w:val="0"/>
+        </w:rPr>
+      </w:r>
+    </w:p>
+    <w:p>
+      <w:pPr>
+        <w:pStyle w:val="ListBullet"/>
+        <w:spacing w:after="40"/>
+      </w:pPr>
+      <w:r>
+        <w:t>Watch the file names in the Files grid: they are cut off, and the agent picks a look-alike file.</w:t>
+      </w:r>
+    </w:p>
+    <w:p>
+      <w:pPr>
+        <w:pStyle w:val="Heading2"/>
+      </w:pPr>
+      <w:r>
+        <w:t>Slide 17: How 275 project runs ended</w:t>
+      </w:r>
+    </w:p>
+    <w:p>
+      <w:pPr>
+        <w:spacing w:after="120"/>
+      </w:pPr>
+      <w:r>
+        <w:rPr>
+          <w:b/>
+        </w:rPr>
+        <w:t xml:space="preserve">What it says. </w:t>
+      </w:r>
+      <w:r>
+        <w:rPr>
+          <w:i w:val="0"/>
+        </w:rPr>
+        <w:t>End reasons of all runs with a machine-readable summary, from the first tests to the final.</w:t>
+      </w:r>
+    </w:p>
+    <w:p>
+      <w:pPr>
+        <w:spacing w:after="120"/>
+      </w:pPr>
+      <w:r>
+        <w:rPr>
+          <w:b/>
+        </w:rPr>
+        <w:t>The data, and where it comes from</w:t>
+      </w:r>
+      <w:r>
+        <w:rPr>
+          <w:i w:val="0"/>
+        </w:rPr>
+      </w:r>
+    </w:p>
+    <w:p>
+      <w:pPr>
+        <w:pStyle w:val="ListBullet"/>
+        <w:spacing w:after="40"/>
+      </w:pPr>
+      <w:r>
+        <w:t>PASS 96; setup or other errors 60; no-progress stops 47; invalid replies 32; step budget used up 21; said done but verifier FAIL 19.</w:t>
+      </w:r>
+    </w:p>
+    <w:p>
+      <w:pPr>
+        <w:pStyle w:val="ListBullet"/>
+        <w:spacing w:after="40"/>
+      </w:pPr>
+      <w:r>
+        <w:t>Setup errors are the largest failure group: emulator, recorder or a crashed service, not the model.</w:t>
+      </w:r>
+    </w:p>
+    <w:p>
+      <w:pPr>
+        <w:pStyle w:val="ListBullet"/>
+        <w:spacing w:after="40"/>
+      </w:pPr>
+      <w:r>
+        <w:t>The card lists the five failure classes from D1 p.50, and the final evaluation's classes: false_done 1, grounding 1, other 1.</w:t>
+      </w:r>
+    </w:p>
+    <w:p>
+      <w:pPr>
+        <w:spacing w:after="120"/>
+      </w:pPr>
+      <w:r>
+        <w:rPr>
+          <w:b/>
+        </w:rPr>
+        <w:t>Words on this slide</w:t>
+      </w:r>
+      <w:r>
+        <w:rPr>
+          <w:i w:val="0"/>
+        </w:rPr>
+      </w:r>
+    </w:p>
+    <w:p>
+      <w:pPr>
+        <w:pStyle w:val="ListBullet"/>
+        <w:spacing w:after="40"/>
+      </w:pPr>
+      <w:r>
+        <w:rPr>
+          <w:b/>
+        </w:rPr>
+        <w:t xml:space="preserve">No-progress stop: </w:t>
+      </w:r>
+      <w:r>
+        <w:t>our rule stops a run when the same action repeats and the screen does not change.</w:t>
+      </w:r>
+    </w:p>
+    <w:p>
+      <w:pPr>
+        <w:pStyle w:val="ListBullet"/>
+        <w:spacing w:after="40"/>
+      </w:pPr>
+      <w:r>
+        <w:rPr>
+          <w:b/>
+        </w:rPr>
+        <w:t xml:space="preserve">Invalid reply: </w:t>
+      </w:r>
+      <w:r>
+        <w:t>two broken answers in one step end the run.</w:t>
+      </w:r>
+    </w:p>
+    <w:p>
+      <w:pPr>
+        <w:pStyle w:val="Heading2"/>
+      </w:pPr>
+      <w:r>
+        <w:t>Slide 18: Deep dive: Files, seed 43</w:t>
+      </w:r>
+    </w:p>
+    <w:p>
+      <w:pPr>
+        <w:spacing w:after="120"/>
+      </w:pPr>
+      <w:r>
+        <w:rPr>
+          <w:b/>
+        </w:rPr>
+        <w:t xml:space="preserve">What it says. </w:t>
+      </w:r>
+      <w:r>
+        <w:rPr>
+          <w:i w:val="0"/>
+        </w:rPr>
+        <w:t>Our main failure analysis. Task: move documentary.mp4 from Alarms to Movies.</w:t>
+      </w:r>
+    </w:p>
+    <w:p>
+      <w:pPr>
+        <w:spacing w:after="120"/>
+      </w:pPr>
+      <w:r>
+        <w:rPr>
+          <w:b/>
+        </w:rPr>
+        <w:t>The data, and where it comes from</w:t>
+      </w:r>
+      <w:r>
+        <w:rPr>
+          <w:i w:val="0"/>
+        </w:rPr>
+      </w:r>
+    </w:p>
+    <w:p>
+      <w:pPr>
+        <w:pStyle w:val="ListBullet"/>
+        <w:spacing w:after="40"/>
+      </w:pPr>
+      <w:r>
+        <w:t>Step 5: the Files grid shows cut-off names (“documentary_20…”). The model picked that file and wrote “…matches the required file documentary.mp4 (assuming it is named differently here)”, inventing the full name.</w:t>
+      </w:r>
+    </w:p>
+    <w:p>
+      <w:pPr>
+        <w:pStyle w:val="ListBullet"/>
+        <w:spacing w:after="40"/>
+      </w:pPr>
+      <w:r>
+        <w:t>Steps 6–11: correct moving steps, but on the wrong file. Steps 12–13: waited for “Moving 1 item” and finished.</w:t>
+      </w:r>
+    </w:p>
+    <w:p>
+      <w:pPr>
+        <w:pStyle w:val="ListBullet"/>
+        <w:spacing w:after="40"/>
+      </w:pPr>
+      <w:r>
+        <w:t>Verifier: FAIL, because documentary.mp4 never moved. Class: false_done; root cause: a look-alike chosen from a truncated name.</w:t>
+      </w:r>
+    </w:p>
+    <w:p>
+      <w:pPr>
+        <w:pStyle w:val="ListBullet"/>
+        <w:spacing w:after="40"/>
+      </w:pPr>
+      <w:r>
+        <w:t>Fix layers: instruction (use list view or search the exact name) and program (check the full name before Move).</w:t>
+      </w:r>
+    </w:p>
+    <w:p>
+      <w:pPr>
+        <w:spacing w:after="120"/>
+      </w:pPr>
+      <w:r>
+        <w:rPr>
+          <w:b/>
+        </w:rPr>
+        <w:t>Words on this slide</w:t>
+      </w:r>
+      <w:r>
+        <w:rPr>
+          <w:i w:val="0"/>
+        </w:rPr>
+      </w:r>
+    </w:p>
+    <w:p>
+      <w:pPr>
+        <w:pStyle w:val="ListBullet"/>
+        <w:spacing w:after="40"/>
+      </w:pPr>
+      <w:r>
+        <w:rPr>
+          <w:b/>
+        </w:rPr>
+        <w:t xml:space="preserve">Distractor files: </w:t>
+      </w:r>
+      <w:r>
+        <w:t>AndroidWorld adds files with similar names to make the task realistic.</w:t>
+      </w:r>
+    </w:p>
+    <w:p>
+      <w:pPr>
+        <w:pStyle w:val="Heading2"/>
+      </w:pPr>
+      <w:r>
+        <w:t>Slide 19: Two more failures, and why runs differ</w:t>
+      </w:r>
+    </w:p>
+    <w:p>
+      <w:pPr>
+        <w:spacing w:after="120"/>
+      </w:pPr>
+      <w:r>
+        <w:rPr>
+          <w:b/>
+        </w:rPr>
+        <w:t xml:space="preserve">What it says. </w:t>
+      </w:r>
+      <w:r>
+        <w:rPr>
+          <w:i w:val="0"/>
+        </w:rPr>
+        <w:t>Contacts seed 43 and OsmAnd seed 366, plus a table showing that the same task can pass on one run and fail on another.</w:t>
+      </w:r>
+    </w:p>
+    <w:p>
+      <w:pPr>
+        <w:spacing w:after="120"/>
+      </w:pPr>
+      <w:r>
+        <w:rPr>
+          <w:b/>
+        </w:rPr>
+        <w:t>The data, and where it comes from</w:t>
+      </w:r>
+      <w:r>
+        <w:rPr>
+          <w:i w:val="0"/>
+        </w:rPr>
+      </w:r>
+    </w:p>
+    <w:p>
+      <w:pPr>
+        <w:pStyle w:val="ListBullet"/>
+        <w:spacing w:after="40"/>
+      </w:pPr>
+      <w:r>
+        <w:t>Contacts s43: two swipes moved the form past the Phone field; four more swipes changed only the blinking cursor, and our own change check counted that as a change, so the model was told its swipe worked. Class: other (navigation).</w:t>
+      </w:r>
+    </w:p>
+    <w:p>
+      <w:pPr>
+        <w:pStyle w:val="ListBullet"/>
+        <w:spacing w:after="40"/>
+      </w:pPr>
+      <w:r>
+        <w:t>OsmAnd s366: our code said “Tap Clear at [941, 83]”; the model tapped [941, 57], the top edge of the button, three times. Class: grounding.</w:t>
+      </w:r>
+    </w:p>
+    <w:p>
+      <w:pPr>
+        <w:pStyle w:val="ListBullet"/>
+        <w:spacing w:after="40"/>
+      </w:pPr>
+      <w:r>
+        <w:t>Table: OsmAnd was 2/3 in two separate frozen evaluations (v61, v65) but a different run failed each time; Contacts seed 43 passed in v42 and failed in v65.</w:t>
+      </w:r>
+    </w:p>
+    <w:p>
+      <w:pPr>
+        <w:spacing w:after="120"/>
+      </w:pPr>
+      <w:r>
+        <w:rPr>
+          <w:b/>
+        </w:rPr>
+        <w:t xml:space="preserve">If someone asks: </w:t>
+      </w:r>
+      <w:r>
+        <w:rPr>
+          <w:i/>
+        </w:rPr>
+        <w:t>Did the agent get worse? Not necessarily: each run starts fresh, and long tasks give more chances for one small error.</w:t>
+      </w:r>
+    </w:p>
+    <w:p>
+      <w:pPr>
+        <w:pStyle w:val="Heading2"/>
+      </w:pPr>
+      <w:r>
+        <w:t>Slide 20: Test-setup problems</w:t>
+      </w:r>
+    </w:p>
+    <w:p>
+      <w:pPr>
+        <w:spacing w:after="120"/>
+      </w:pPr>
+      <w:r>
+        <w:rPr>
+          <w:b/>
+        </w:rPr>
+        <w:t xml:space="preserve">What it says. </w:t>
+      </w:r>
+      <w:r>
+        <w:rPr>
+          <w:i w:val="0"/>
+        </w:rPr>
+        <w:t>Problems that were not the model's fault, and their fixes.</w:t>
+      </w:r>
+    </w:p>
+    <w:p>
+      <w:pPr>
+        <w:spacing w:after="120"/>
+      </w:pPr>
+      <w:r>
+        <w:rPr>
+          <w:b/>
+        </w:rPr>
+        <w:t>The data, and where it comes from</w:t>
+      </w:r>
+      <w:r>
+        <w:rPr>
+          <w:i w:val="0"/>
+        </w:rPr>
+      </w:r>
+    </w:p>
+    <w:p>
+      <w:pPr>
+        <w:pStyle w:val="ListBullet"/>
+        <w:spacing w:after="40"/>
+      </w:pPr>
+      <w:r>
+        <w:t>Black screenshots (emulator graphics mode), recorder stopped (Android tools restarted their server), app start timeouts (5 s too short).</w:t>
+      </w:r>
+    </w:p>
+    <w:p>
+      <w:pPr>
+        <w:pStyle w:val="ListBullet"/>
+        <w:spacing w:after="40"/>
+      </w:pPr>
+      <w:r>
+        <w:t>“keeps stopping” dialog: AndroidWorld's accessibility service crashed in 11 of 25 OsmAnd runs from v49 on; the model closes it and the empty screen read is repeated.</w:t>
+      </w:r>
+    </w:p>
+    <w:p>
+      <w:pPr>
+        <w:pStyle w:val="ListBullet"/>
+        <w:spacing w:after="40"/>
+      </w:pPr>
+      <w:r>
+        <w:t>OsmAnd map missing: the Files task's initialization deletes shared storage; the runner now restores the map.</w:t>
+      </w:r>
+    </w:p>
+    <w:p>
+      <w:pPr>
+        <w:spacing w:after="120"/>
+      </w:pPr>
+      <w:r>
+        <w:rPr>
+          <w:b/>
+        </w:rPr>
+        <w:t>Words on this slide</w:t>
+      </w:r>
+      <w:r>
+        <w:rPr>
+          <w:i w:val="0"/>
+        </w:rPr>
+      </w:r>
+    </w:p>
+    <w:p>
+      <w:pPr>
+        <w:pStyle w:val="ListBullet"/>
+        <w:spacing w:after="40"/>
+      </w:pPr>
+      <w:r>
+        <w:rPr>
+          <w:b/>
+        </w:rPr>
+        <w:t xml:space="preserve">Harness: </w:t>
+      </w:r>
+      <w:r>
+        <w:t>everything around the model: emulator, recorder, runner, verifier.</w:t>
+      </w:r>
+    </w:p>
+    <w:p>
+      <w:pPr>
+        <w:pStyle w:val="Heading2"/>
+      </w:pPr>
+      <w:r>
+        <w:t>Slide 21: The hardest task: from zero passes to two of three</w:t>
+      </w:r>
+    </w:p>
+    <w:p>
+      <w:pPr>
+        <w:spacing w:after="120"/>
+      </w:pPr>
+      <w:r>
+        <w:rPr>
+          <w:b/>
+        </w:rPr>
+        <w:t xml:space="preserve">What it says. </w:t>
+      </w:r>
+      <w:r>
+        <w:rPr>
+          <w:i w:val="0"/>
+        </w:rPr>
+        <w:t>All OsmAnd runs grouped by version phase, with how many passed.</w:t>
+      </w:r>
+    </w:p>
+    <w:p>
+      <w:pPr>
+        <w:spacing w:after="120"/>
+      </w:pPr>
+      <w:r>
+        <w:rPr>
+          <w:b/>
+        </w:rPr>
+        <w:t>The data, and where it comes from</w:t>
+      </w:r>
+      <w:r>
+        <w:rPr>
+          <w:i w:val="0"/>
+        </w:rPr>
+      </w:r>
+    </w:p>
+    <w:p>
+      <w:pPr>
+        <w:pStyle w:val="ListBullet"/>
+        <w:spacing w:after="40"/>
+      </w:pPr>
+      <w:r>
+        <w:t>v30–v42 (Skill as text): 26 runs, 0 passed. v43–v48 (rules on the model's words): 10, 0. v49–v58 (reads the screen): 10, 0.</w:t>
+      </w:r>
+    </w:p>
+    <w:p>
+      <w:pPr>
+        <w:pStyle w:val="ListBullet"/>
+        <w:spacing w:after="40"/>
+      </w:pPr>
+      <w:r>
+        <w:t>v59–v62 (Skill as code): 11 runs, 5 passed. v63–v65 (final agent): 4 runs, 3 passed.</w:t>
+      </w:r>
+    </w:p>
+    <w:p>
+      <w:pPr>
+        <w:pStyle w:val="ListBullet"/>
+        <w:spacing w:after="40"/>
+      </w:pPr>
+      <w:r>
+        <w:t>So 46 runs without a pass, then 8 passes in the next 15. Fixes were tested on practice seeds, never on the evaluation seeds.</w:t>
+      </w:r>
+    </w:p>
+    <w:p>
+      <w:pPr>
+        <w:pStyle w:val="Heading2"/>
+      </w:pPr>
+      <w:r>
+        <w:t>Slide 22: Before and after</w:t>
+      </w:r>
+    </w:p>
+    <w:p>
+      <w:pPr>
+        <w:spacing w:after="120"/>
+      </w:pPr>
+      <w:r>
+        <w:rPr>
+          <w:b/>
+        </w:rPr>
+        <w:t xml:space="preserve">What it says. </w:t>
+      </w:r>
+      <w:r>
+        <w:rPr>
+          <w:i w:val="0"/>
+        </w:rPr>
+        <w:t>The documented improvement: same frozen code (v61), same seeds, same model; only the Skill on or off.</w:t>
+      </w:r>
+    </w:p>
+    <w:p>
+      <w:pPr>
+        <w:spacing w:after="120"/>
+      </w:pPr>
+      <w:r>
+        <w:rPr>
+          <w:b/>
+        </w:rPr>
+        <w:t>The data, and where it comes from</w:t>
+      </w:r>
+      <w:r>
+        <w:rPr>
+          <w:i w:val="0"/>
+        </w:rPr>
+      </w:r>
+    </w:p>
+    <w:p>
+      <w:pPr>
+        <w:pStyle w:val="ListBullet"/>
+        <w:spacing w:after="40"/>
+      </w:pPr>
+      <w:r>
+        <w:t>Verifier PASS 0/3 → 2/3; searched the place name only 0/3 → 3/3; route started with a searched place 0/3 → 2/3; saved a track 0/3 → 2/3; mean steps 23.3 → 18.7.</w:t>
+      </w:r>
+    </w:p>
+    <w:p>
+      <w:pPr>
+        <w:pStyle w:val="ListBullet"/>
+        <w:spacing w:after="40"/>
+      </w:pPr>
+      <w:r>
+        <w:t>Chart: text Skill only (v42, other seeds) 0; no Skill (v61) 0; Skill as code (v61) 2; final agent (v65) 2.</w:t>
+      </w:r>
+    </w:p>
+    <w:p>
+      <w:pPr>
+        <w:pStyle w:val="ListBullet"/>
+        <w:spacing w:after="40"/>
+      </w:pPr>
+      <w:r>
+        <w:t>Without the Skill the model typed “Ruggell, Liechtenstein” (finds only the country) and two runs used navigation, which never saves a track.</w:t>
+      </w:r>
+    </w:p>
+    <w:p>
+      <w:pPr>
+        <w:spacing w:after="120"/>
+      </w:pPr>
+      <w:r>
+        <w:rPr>
+          <w:b/>
+        </w:rPr>
+        <w:t xml:space="preserve">If someone asks: </w:t>
+      </w:r>
+      <w:r>
+        <w:rPr>
+          <w:i/>
+        </w:rPr>
+        <w:t>Is it fair? Only one setting changed, and both batches have the same source fingerprint. Three runs per side is still small.</w:t>
+      </w:r>
+    </w:p>
+    <w:p>
+      <w:pPr>
+        <w:pStyle w:val="Heading2"/>
+      </w:pPr>
+      <w:r>
+        <w:t>Slide 23: Lessons built into the final agent</w:t>
+      </w:r>
+    </w:p>
+    <w:p>
+      <w:pPr>
+        <w:spacing w:after="120"/>
+      </w:pPr>
+      <w:r>
+        <w:rPr>
+          <w:b/>
+        </w:rPr>
+        <w:t xml:space="preserve">What it says. </w:t>
+      </w:r>
+      <w:r>
+        <w:rPr>
+          <w:i w:val="0"/>
+        </w:rPr>
+        <w:t>Each failure we saw, its cause, the change, and the final result.</w:t>
+      </w:r>
+    </w:p>
+    <w:p>
+      <w:pPr>
+        <w:spacing w:after="120"/>
+      </w:pPr>
+      <w:r>
+        <w:rPr>
+          <w:b/>
+        </w:rPr>
+        <w:t>The data, and where it comes from</w:t>
+      </w:r>
+      <w:r>
+        <w:rPr>
+          <w:i w:val="0"/>
+        </w:rPr>
+      </w:r>
+    </w:p>
+    <w:p>
+      <w:pPr>
+        <w:pStyle w:val="ListBullet"/>
+        <w:spacing w:after="40"/>
+      </w:pPr>
+      <w:r>
+        <w:t>Markor “Not sent” → Markor Skill → Markor 3/3.</w:t>
+      </w:r>
+    </w:p>
+    <w:p>
+      <w:pPr>
+        <w:pStyle w:val="ListBullet"/>
+        <w:spacing w:after="40"/>
+      </w:pPr>
+      <w:r>
+        <w:t>Markor typing refused (custom editor) → focus check fixed → Markor 3/3.</w:t>
+      </w:r>
+    </w:p>
+    <w:p>
+      <w:pPr>
+        <w:pStyle w:val="ListBullet"/>
+        <w:spacing w:after="40"/>
+      </w:pPr>
+      <w:r>
+        <w:t>SMS app name in Chinese → alias table → Markor 3/3.</w:t>
+      </w:r>
+    </w:p>
+    <w:p>
+      <w:pPr>
+        <w:pStyle w:val="ListBullet"/>
+        <w:spacing w:after="40"/>
+      </w:pPr>
+      <w:r>
+        <w:t>OsmAnd map missing → map check plus official setup → OsmAnd 2/3.</w:t>
+      </w:r>
+    </w:p>
+    <w:p>
+      <w:pPr>
+        <w:pStyle w:val="ListBullet"/>
+        <w:spacing w:after="40"/>
+      </w:pPr>
+      <w:r>
+        <w:t>OsmAnd 0/3 → Skill as code plus GUI tree → OsmAnd 2/3.</w:t>
+      </w:r>
+    </w:p>
+    <w:p>
+      <w:pPr>
+        <w:pStyle w:val="ListBullet"/>
+        <w:spacing w:after="40"/>
+      </w:pPr>
+      <w:r>
+        <w:t>38 automatic offline tests; each fix has a test that fails on the old code and passes on the new code.</w:t>
+      </w:r>
+    </w:p>
+    <w:p>
+      <w:pPr>
+        <w:pStyle w:val="Heading2"/>
+      </w:pPr>
+      <w:r>
+        <w:t>Slide 24: Our work in numbers</w:t>
+      </w:r>
+    </w:p>
+    <w:p>
+      <w:pPr>
+        <w:spacing w:after="120"/>
+      </w:pPr>
+      <w:r>
+        <w:rPr>
+          <w:b/>
+        </w:rPr>
+        <w:t xml:space="preserve">What it says. </w:t>
+      </w:r>
+      <w:r>
+        <w:rPr>
+          <w:i w:val="0"/>
+        </w:rPr>
+        <w:t>Six numbers behind the result.</w:t>
+      </w:r>
+    </w:p>
+    <w:p>
+      <w:pPr>
+        <w:spacing w:after="120"/>
+      </w:pPr>
+      <w:r>
+        <w:rPr>
+          <w:b/>
+        </w:rPr>
+        <w:t>The data, and where it comes from</w:t>
+      </w:r>
+      <w:r>
+        <w:rPr>
+          <w:i w:val="0"/>
+        </w:rPr>
+      </w:r>
+    </w:p>
+    <w:p>
+      <w:pPr>
+        <w:pStyle w:val="ListBullet"/>
+        <w:spacing w:after="40"/>
+      </w:pPr>
+      <w:r>
+        <w:t>~300 recorded runs; 65 agent versions; 1,453 steps and 1,642 model calls in the runs of this agent's line on our machine; 38 offline tests; 0.48 € model cost of all those local runs.</w:t>
+      </w:r>
+    </w:p>
+    <w:p>
+      <w:pPr>
+        <w:pStyle w:val="Heading2"/>
+      </w:pPr>
+      <w:r>
+        <w:t>Slide 25: Findings and limitations</w:t>
+      </w:r>
+    </w:p>
+    <w:p>
+      <w:pPr>
+        <w:spacing w:after="120"/>
+      </w:pPr>
+      <w:r>
+        <w:rPr>
+          <w:b/>
+        </w:rPr>
+        <w:t xml:space="preserve">What it says. </w:t>
+      </w:r>
+      <w:r>
+        <w:rPr>
+          <w:i w:val="0"/>
+        </w:rPr>
+        <w:t>What we learned and what is still limited.</w:t>
+      </w:r>
+    </w:p>
+    <w:p>
+      <w:pPr>
+        <w:spacing w:after="120"/>
+      </w:pPr>
+      <w:r>
+        <w:rPr>
+          <w:b/>
+        </w:rPr>
+        <w:t>The data, and where it comes from</w:t>
+      </w:r>
+      <w:r>
+        <w:rPr>
+          <w:i w:val="0"/>
+        </w:rPr>
+      </w:r>
+    </w:p>
+    <w:p>
+      <w:pPr>
+        <w:pStyle w:val="ListBullet"/>
+        <w:spacing w:after="40"/>
+      </w:pPr>
+      <w:r>
+        <w:t>Findings: trust the harness first; the verifier decides; where knowledge lives matters (prompt &lt; reminder each step &lt; code); long tasks fail by small errors; checks catch traps (8 in the final runs).</w:t>
+      </w:r>
+    </w:p>
+    <w:p>
+      <w:pPr>
+        <w:pStyle w:val="ListBullet"/>
+        <w:spacing w:after="40"/>
+      </w:pPr>
+      <w:r>
+        <w:t>Limitations: three runs per task; one model, one laptop, one emulator; the OsmAnd Skill only works for OsmAnd; two tasks used extra screen labels; fixes after the freeze are not evaluated.</w:t>
+      </w:r>
+    </w:p>
+    <w:p>
+      <w:pPr>
+        <w:pStyle w:val="Heading2"/>
+      </w:pPr>
+      <w:r>
+        <w:t>Slide 26: Thank you</w:t>
+      </w:r>
+    </w:p>
+    <w:p>
+      <w:pPr>
+        <w:spacing w:after="120"/>
+      </w:pPr>
+      <w:r>
+        <w:rPr>
+          <w:b/>
+        </w:rPr>
+        <w:t xml:space="preserve">What it says. </w:t>
+      </w:r>
+      <w:r>
+        <w:rPr>
+          <w:i w:val="0"/>
+        </w:rPr>
+        <w:t>Repository, branch and tag, model and benchmark. The questions and short answers we prepared are in QA.md.</w:t>
+      </w:r>
+    </w:p>
+    <w:p>
+      <w:pPr>
+        <w:pStyle w:val="Heading2"/>
+      </w:pPr>
+      <w:r>
+        <w:t>Slide 27: Appendix: actions and observation</w:t>
+      </w:r>
+    </w:p>
+    <w:p>
+      <w:pPr>
+        <w:spacing w:after="120"/>
+      </w:pPr>
+      <w:r>
+        <w:rPr>
+          <w:b/>
+        </w:rPr>
+        <w:t xml:space="preserve">What it says. </w:t>
+      </w:r>
+      <w:r>
+        <w:rPr>
+          <w:i w:val="0"/>
+        </w:rPr>
+        <w:t>The seven actions the model may use, with real examples, and what the agent sees in each task.</w:t>
+      </w:r>
+    </w:p>
+    <w:p>
+      <w:pPr>
+        <w:spacing w:after="120"/>
+      </w:pPr>
+      <w:r>
+        <w:rPr>
+          <w:b/>
+        </w:rPr>
+        <w:t>The data, and where it comes from</w:t>
+      </w:r>
+      <w:r>
+        <w:rPr>
+          <w:i w:val="0"/>
+        </w:rPr>
+      </w:r>
+    </w:p>
+    <w:p>
+      <w:pPr>
+        <w:pStyle w:val="ListBullet"/>
+        <w:spacing w:after="40"/>
+      </w:pPr>
+      <w:r>
+        <w:rPr>
+          <w:b/>
+        </w:rPr>
         <w:t xml:space="preserve">Wi-Fi: </w:t>
       </w:r>
       <w:r>
@@ -4326,7 +6264,7 @@
         <w:pStyle w:val="Heading2"/>
       </w:pPr>
       <w:r>
-        <w:t>Slide 8: Context and Skills</w:t>
+        <w:t>Slide 28: Appendix: steps versus the reference</w:t>
       </w:r>
     </w:p>
     <w:p>
@@ -4343,7 +6281,7 @@
         <w:rPr>
           <w:i w:val="0"/>
         </w:rPr>
-        <w:t>What goes into each model request, and the two Skills.</w:t>
+        <w:t>Mean steps of passing runs compared with the course's reference steps and our step budget.</w:t>
       </w:r>
     </w:p>
     <w:p>
@@ -4368,13 +6306,7 @@
         <w:spacing w:after="40"/>
       </w:pPr>
       <w:r>
-        <w:rPr>
-          <w:b/>
-        </w:rPr>
-        <w:t xml:space="preserve">Every request: </w:t>
-      </w:r>
-      <w:r>
-        <w:t>action rules, a completion rule (what done looks like), the last 20 steps, the newest screenshot, a short status.</w:t>
+        <w:t>Ours: Wi-Fi 5, Contacts 11.5, SMS 7.7, Files 15, Calendar 19, Markor 17, OsmAnd 22.5.</w:t>
       </w:r>
     </w:p>
     <w:p>
@@ -4383,13 +6315,7 @@
         <w:spacing w:after="40"/>
       </w:pPr>
       <w:r>
-        <w:rPr>
-          <w:b/>
-        </w:rPr>
-        <w:t xml:space="preserve">Markor Skill (text): </w:t>
-      </w:r>
-      <w:r>
-        <w:t>built from the Markor failure analysis: never use Markor's Share menu; type the text into a new plain SMS.</w:t>
+        <w:t>Reference: 3, 5, 6, 10, 17, 9, 60. Budget: 12, 16, 20, 25, 35, 40, 90.</w:t>
       </w:r>
     </w:p>
     <w:p>
@@ -4398,69 +6324,15 @@
         <w:spacing w:after="40"/>
       </w:pPr>
       <w:r>
-        <w:rPr>
-          <w:b/>
-        </w:rPr>
-        <w:t xml:space="preserve">OsmAnd Skill (code): </w:t>
-      </w:r>
-      <w:r>
-        <w:t>recognises the screen from the GUI tree and states the next step and its tap centre.</w:t>
+        <w:t>Markor uses about twice the reference because the agent types the text twice (note and SMS) instead of sharing it; OsmAnd uses far fewer than the reference because the Skill leads the shortest path.</w:t>
       </w:r>
     </w:p>
     <w:p>
       <w:pPr>
-        <w:spacing w:after="120"/>
-      </w:pPr>
-      <w:r>
-        <w:rPr>
-          <w:b/>
-        </w:rPr>
-        <w:t>Words on this slide</w:t>
-      </w:r>
-      <w:r>
-        <w:rPr>
-          <w:i w:val="0"/>
-        </w:rPr>
-      </w:r>
-    </w:p>
-    <w:p>
-      <w:pPr>
-        <w:pStyle w:val="ListBullet"/>
-        <w:spacing w:after="40"/>
-      </w:pPr>
-      <w:r>
-        <w:rPr>
-          <w:b/>
-        </w:rPr>
-        <w:t xml:space="preserve">Completion rule: </w:t>
-      </w:r>
-      <w:r>
-        <w:t>one sentence per task, for example “the saved contact view shows the exact name and number; a filled form is not enough”.</w:t>
-      </w:r>
-    </w:p>
-    <w:p>
-      <w:pPr>
-        <w:spacing w:after="120"/>
-      </w:pPr>
-      <w:r>
-        <w:rPr>
-          <w:b/>
-        </w:rPr>
-        <w:t xml:space="preserve">If someone asks: </w:t>
-      </w:r>
-      <w:r>
-        <w:rPr>
-          <w:i/>
-        </w:rPr>
-        <w:t>Is the OsmAnd Skill a script? It suggests, the model decides and acts, and it sometimes ignored the suggestion. It only works for OsmAnd.</w:t>
-      </w:r>
-    </w:p>
-    <w:p>
-      <w:pPr>
         <w:pStyle w:val="Heading2"/>
       </w:pPr>
       <w:r>
-        <w:t>Slide 9: Safety net</w:t>
+        <w:t>Slide 29: Appendix: speed and cost</w:t>
       </w:r>
     </w:p>
     <w:p>
@@ -4477,7 +6349,7 @@
         <w:rPr>
           <w:i w:val="0"/>
         </w:rPr>
-        <w:t>Actions are checked before they reach the phone. Refused actions are not executed; the model gets the reason and one correction in the same step.</w:t>
+        <w:t>Mean run time per task and the cost of the final evaluation.</w:t>
       </w:r>
     </w:p>
     <w:p>
@@ -4502,13 +6374,7 @@
         <w:spacing w:after="40"/>
       </w:pPr>
       <w:r>
-        <w:rPr>
-          <w:b/>
-        </w:rPr>
-        <w:t xml:space="preserve">8 refusals in the final runs, in 7 of 21 runs: </w:t>
-      </w:r>
-      <w:r>
-        <w:t>3 typing with no focused text field, 2 malformed replies, 1 unsupported action, 1 truncated reply, 1 OsmAnd favourite button.</w:t>
+        <w:t>Mean run time (s): Wi-Fi 71, Contacts 95, SMS 71, Files 109, Calendar 153, Markor 261, OsmAnd 537. Times include app start, setup and recording; one OsmAnd run also included restoring the map.</w:t>
       </w:r>
     </w:p>
     <w:p>
@@ -4517,1365 +6383,16 @@
         <w:spacing w:after="40"/>
       </w:pPr>
       <w:r>
-        <w:rPr>
-          <w:b/>
-        </w:rPr>
-        <w:t>6 of the 7 runs with a refusal still passed.</w:t>
-      </w:r>
-      <w:r/>
+        <w:t>1.45 M tokens (1,423,741 prompt + 23,737 completion) × 0.045 € per million = about 0.065 €.</w:t>
+      </w:r>
     </w:p>
     <w:p>
       <w:pPr>
-        <w:spacing w:after="120"/>
-      </w:pPr>
-      <w:r>
-        <w:rPr>
-          <w:b/>
-        </w:rPr>
-        <w:t>Words on this slide</w:t>
-      </w:r>
-      <w:r>
-        <w:rPr>
-          <w:i w:val="0"/>
-        </w:rPr>
-      </w:r>
-    </w:p>
-    <w:p>
-      <w:pPr>
         <w:pStyle w:val="ListBullet"/>
         <w:spacing w:after="40"/>
       </w:pPr>
       <w:r>
-        <w:rPr>
-          <w:b/>
-        </w:rPr>
-        <w:t xml:space="preserve">Malformed reply: </w:t>
-      </w:r>
-      <w:r>
-        <w:t>the model did not give exactly one action.</w:t>
-      </w:r>
-    </w:p>
-    <w:p>
-      <w:pPr>
-        <w:pStyle w:val="ListBullet"/>
-        <w:spacing w:after="40"/>
-      </w:pPr>
-      <w:r>
-        <w:rPr>
-          <w:b/>
-        </w:rPr>
-        <w:t xml:space="preserve">Favourite button: </w:t>
-      </w:r>
-      <w:r>
-        <w:t>on an OsmAnd place card it saves a favourite, not a route point.</w:t>
-      </w:r>
-    </w:p>
-    <w:p>
-      <w:pPr>
-        <w:pStyle w:val="Heading2"/>
-      </w:pPr>
-      <w:r>
-        <w:t>Slide 10: One run step by step</w:t>
-      </w:r>
-    </w:p>
-    <w:p>
-      <w:pPr>
-        <w:spacing w:after="120"/>
-      </w:pPr>
-      <w:r>
-        <w:rPr>
-          <w:b/>
-        </w:rPr>
-        <w:t xml:space="preserve">What it says. </w:t>
-      </w:r>
-      <w:r>
-        <w:rPr>
-          <w:i w:val="0"/>
-        </w:rPr>
-        <w:t>Markor with seed 44 (15 steps, PASS): six screenshots and, under each, a sentence from the model's own reasoning in the log.</w:t>
-      </w:r>
-    </w:p>
-    <w:p>
-      <w:pPr>
-        <w:spacing w:after="120"/>
-      </w:pPr>
-      <w:r>
-        <w:rPr>
-          <w:b/>
-        </w:rPr>
-        <w:t>The data, and where it comes from</w:t>
-      </w:r>
-      <w:r>
-        <w:rPr>
-          <w:i w:val="0"/>
-        </w:rPr>
-      </w:r>
-    </w:p>
-    <w:p>
-      <w:pPr>
-        <w:pStyle w:val="ListBullet"/>
-        <w:spacing w:after="40"/>
-      </w:pPr>
-      <w:r>
-        <w:t>Steps 2, 4, 8, 10, 14 and 15 of run trial_MarkorCreateNoteAndSms_20261008T222633_440045Z.</w:t>
-      </w:r>
-    </w:p>
-    <w:p>
-      <w:pPr>
-        <w:spacing w:after="120"/>
-      </w:pPr>
-      <w:r>
-        <w:rPr>
-          <w:b/>
-        </w:rPr>
-        <w:t xml:space="preserve">If someone asks: </w:t>
-      </w:r>
-      <w:r>
-        <w:rPr>
-          <w:i/>
-        </w:rPr>
-        <w:t>Did the model really write these sentences? Yes, they are verbatim from its replies in the trajectory log.</w:t>
-      </w:r>
-    </w:p>
-    <w:p>
-      <w:pPr>
-        <w:pStyle w:val="Heading2"/>
-      </w:pPr>
-      <w:r>
-        <w:t>Slide 11: How we tested</w:t>
-      </w:r>
-    </w:p>
-    <w:p>
-      <w:pPr>
-        <w:spacing w:after="120"/>
-      </w:pPr>
-      <w:r>
-        <w:rPr>
-          <w:b/>
-        </w:rPr>
-        <w:t xml:space="preserve">What it says. </w:t>
-      </w:r>
-      <w:r>
-        <w:rPr>
-          <w:i w:val="0"/>
-        </w:rPr>
-        <w:t>One frozen version, three runs per task, the official verifier, and one log row per run in the course's format.</w:t>
-      </w:r>
-    </w:p>
-    <w:p>
-      <w:pPr>
-        <w:spacing w:after="120"/>
-      </w:pPr>
-      <w:r>
-        <w:rPr>
-          <w:b/>
-        </w:rPr>
-        <w:t>The data, and where it comes from</w:t>
-      </w:r>
-      <w:r>
-        <w:rPr>
-          <w:i w:val="0"/>
-        </w:rPr>
-      </w:r>
-    </w:p>
-    <w:p>
-      <w:pPr>
-        <w:pStyle w:val="ListBullet"/>
-        <w:spacing w:after="40"/>
-      </w:pPr>
-      <w:r>
-        <w:rPr>
-          <w:b/>
-        </w:rPr>
-        <w:t xml:space="preserve">Tag team-agent-final-v65: </w:t>
-      </w:r>
-      <w:r>
-        <w:t>both batches recorded the same source fingerprint (hashes of the agent's files).</w:t>
-      </w:r>
-    </w:p>
-    <w:p>
-      <w:pPr>
-        <w:pStyle w:val="ListBullet"/>
-        <w:spacing w:after="40"/>
-      </w:pPr>
-      <w:r>
-        <w:rPr>
-          <w:b/>
-        </w:rPr>
-        <w:t xml:space="preserve">Seeds 42, 43, 44 for six tasks; 31, 314, 366 for OsmAnd: </w:t>
-      </w:r>
-      <w:r>
-        <w:t>these three OsmAnd seeds all produce the slide's route.</w:t>
-      </w:r>
-    </w:p>
-    <w:p>
-      <w:pPr>
-        <w:pStyle w:val="ListBullet"/>
-        <w:spacing w:after="40"/>
-      </w:pPr>
-      <w:r>
-        <w:rPr>
-          <w:b/>
-        </w:rPr>
-        <w:t xml:space="preserve">Step budgets: </w:t>
-      </w:r>
-      <w:r>
-        <w:t>about 2 to 4 times the reference steps (Wi-Fi 12, Contacts 16, SMS 20, Files 25, Calendar 35, Markor 40, OsmAnd 90).</w:t>
-      </w:r>
-    </w:p>
-    <w:p>
-      <w:pPr>
-        <w:pStyle w:val="ListBullet"/>
-        <w:spacing w:after="40"/>
-      </w:pPr>
-      <w:r>
-        <w:rPr>
-          <w:b/>
-        </w:rPr>
-        <w:t xml:space="preserve">Example row: </w:t>
-      </w:r>
-      <w:r>
-        <w:t>the failed Files run, in the fields of the course slide D1 p.49.</w:t>
-      </w:r>
-    </w:p>
-    <w:p>
-      <w:pPr>
-        <w:spacing w:after="120"/>
-      </w:pPr>
-      <w:r>
-        <w:rPr>
-          <w:b/>
-        </w:rPr>
-        <w:t xml:space="preserve">If someone asks: </w:t>
-      </w:r>
-      <w:r>
-        <w:rPr>
-          <w:i/>
-        </w:rPr>
-        <w:t>Why not rerun failures? Rerunning the same code until it passes only measures luck.</w:t>
-      </w:r>
-    </w:p>
-    <w:p>
-      <w:pPr>
-        <w:pStyle w:val="Heading2"/>
-      </w:pPr>
-      <w:r>
-        <w:t>Slide 12: Results</w:t>
-      </w:r>
-    </w:p>
-    <w:p>
-      <w:pPr>
-        <w:spacing w:after="120"/>
-      </w:pPr>
-      <w:r>
-        <w:rPr>
-          <w:b/>
-        </w:rPr>
-        <w:t xml:space="preserve">What it says. </w:t>
-      </w:r>
-      <w:r>
-        <w:rPr>
-          <w:i w:val="0"/>
-        </w:rPr>
-        <w:t>All 21 runs: blue PASS, orange FAIL with its failure class.</w:t>
-      </w:r>
-    </w:p>
-    <w:p>
-      <w:pPr>
-        <w:spacing w:after="120"/>
-      </w:pPr>
-      <w:r>
-        <w:rPr>
-          <w:b/>
-        </w:rPr>
-        <w:t>The data, and where it comes from</w:t>
-      </w:r>
-      <w:r>
-        <w:rPr>
-          <w:i w:val="0"/>
-        </w:rPr>
-      </w:r>
-    </w:p>
-    <w:p>
-      <w:pPr>
-        <w:pStyle w:val="ListBullet"/>
-        <w:spacing w:after="40"/>
-      </w:pPr>
-      <w:r>
-        <w:t>Wi-Fi, SMS, Calendar, Markor 3/3; Contacts, Files, OsmAnd 2/3. Hard tasks together 5/6.</w:t>
-      </w:r>
-    </w:p>
-    <w:p>
-      <w:pPr>
-        <w:pStyle w:val="ListBullet"/>
-        <w:spacing w:after="40"/>
-      </w:pPr>
-      <w:r>
-        <w:t>The “s” number in each cell is the task seed.</w:t>
-      </w:r>
-    </w:p>
-    <w:p>
-      <w:pPr>
-        <w:pStyle w:val="Heading2"/>
-      </w:pPr>
-      <w:r>
-        <w:t>Slide 13: Steps versus the reference</w:t>
-      </w:r>
-    </w:p>
-    <w:p>
-      <w:pPr>
-        <w:spacing w:after="120"/>
-      </w:pPr>
-      <w:r>
-        <w:rPr>
-          <w:b/>
-        </w:rPr>
-        <w:t xml:space="preserve">What it says. </w:t>
-      </w:r>
-      <w:r>
-        <w:rPr>
-          <w:i w:val="0"/>
-        </w:rPr>
-        <w:t>Mean steps of passing runs compared with the course's reference steps and our step budget.</w:t>
-      </w:r>
-    </w:p>
-    <w:p>
-      <w:pPr>
-        <w:spacing w:after="120"/>
-      </w:pPr>
-      <w:r>
-        <w:rPr>
-          <w:b/>
-        </w:rPr>
-        <w:t>The data, and where it comes from</w:t>
-      </w:r>
-      <w:r>
-        <w:rPr>
-          <w:i w:val="0"/>
-        </w:rPr>
-      </w:r>
-    </w:p>
-    <w:p>
-      <w:pPr>
-        <w:pStyle w:val="ListBullet"/>
-        <w:spacing w:after="40"/>
-      </w:pPr>
-      <w:r>
-        <w:t>Ours: Wi-Fi 5, Contacts 11.5, SMS 7.7, Files 15, Calendar 19, Markor 17, OsmAnd 22.5.</w:t>
-      </w:r>
-    </w:p>
-    <w:p>
-      <w:pPr>
-        <w:pStyle w:val="ListBullet"/>
-        <w:spacing w:after="40"/>
-      </w:pPr>
-      <w:r>
-        <w:t>Reference: 3, 5, 6, 10, 17, 9, 60. Budget: 12, 16, 20, 25, 35, 40, 90.</w:t>
-      </w:r>
-    </w:p>
-    <w:p>
-      <w:pPr>
-        <w:pStyle w:val="ListBullet"/>
-        <w:spacing w:after="40"/>
-      </w:pPr>
-      <w:r>
-        <w:t>Markor uses about twice the reference because the agent types the text twice (note and SMS) instead of sharing it; OsmAnd uses far fewer than the reference because the Skill leads the shortest path.</w:t>
-      </w:r>
-    </w:p>
-    <w:p>
-      <w:pPr>
-        <w:pStyle w:val="Heading2"/>
-      </w:pPr>
-      <w:r>
-        <w:t>Slide 14: Speed and cost</w:t>
-      </w:r>
-    </w:p>
-    <w:p>
-      <w:pPr>
-        <w:spacing w:after="120"/>
-      </w:pPr>
-      <w:r>
-        <w:rPr>
-          <w:b/>
-        </w:rPr>
-        <w:t xml:space="preserve">What it says. </w:t>
-      </w:r>
-      <w:r>
-        <w:rPr>
-          <w:i w:val="0"/>
-        </w:rPr>
-        <w:t>Mean run time per task and the cost of the final evaluation.</w:t>
-      </w:r>
-    </w:p>
-    <w:p>
-      <w:pPr>
-        <w:spacing w:after="120"/>
-      </w:pPr>
-      <w:r>
-        <w:rPr>
-          <w:b/>
-        </w:rPr>
-        <w:t>The data, and where it comes from</w:t>
-      </w:r>
-      <w:r>
-        <w:rPr>
-          <w:i w:val="0"/>
-        </w:rPr>
-      </w:r>
-    </w:p>
-    <w:p>
-      <w:pPr>
-        <w:pStyle w:val="ListBullet"/>
-        <w:spacing w:after="40"/>
-      </w:pPr>
-      <w:r>
-        <w:t>Mean run time (s): Wi-Fi 71, Contacts 95, SMS 71, Files 109, Calendar 153, Markor 261, OsmAnd 537. Times include app start, setup and recording; one OsmAnd run also included restoring the map.</w:t>
-      </w:r>
-    </w:p>
-    <w:p>
-      <w:pPr>
-        <w:pStyle w:val="ListBullet"/>
-        <w:spacing w:after="40"/>
-      </w:pPr>
-      <w:r>
-        <w:t>1.45 M tokens (1,423,741 prompt + 23,737 completion) × 0.045 € per million = about 0.065 €.</w:t>
-      </w:r>
-    </w:p>
-    <w:p>
-      <w:pPr>
-        <w:pStyle w:val="ListBullet"/>
-        <w:spacing w:after="40"/>
-      </w:pPr>
-      <w:r>
         <w:t>All runs on our machine together: 10.8 M tokens, about 0.48 €.</w:t>
-      </w:r>
-    </w:p>
-    <w:p>
-      <w:pPr>
-        <w:pStyle w:val="Heading2"/>
-      </w:pPr>
-      <w:r>
-        <w:t>Slide 15: Demo: all 21 runs</w:t>
-      </w:r>
-    </w:p>
-    <w:p>
-      <w:pPr>
-        <w:spacing w:after="120"/>
-      </w:pPr>
-      <w:r>
-        <w:rPr>
-          <w:b/>
-        </w:rPr>
-        <w:t xml:space="preserve">What it says. </w:t>
-      </w:r>
-      <w:r>
-        <w:rPr>
-          <w:i w:val="0"/>
-        </w:rPr>
-        <w:t>One video with all 21 final runs at once. Columns are tasks, rows are runs.</w:t>
-      </w:r>
-    </w:p>
-    <w:p>
-      <w:pPr>
-        <w:spacing w:after="120"/>
-      </w:pPr>
-      <w:r>
-        <w:rPr>
-          <w:b/>
-        </w:rPr>
-        <w:t>The data, and where it comes from</w:t>
-      </w:r>
-      <w:r>
-        <w:rPr>
-          <w:i w:val="0"/>
-        </w:rPr>
-      </w:r>
-    </w:p>
-    <w:p>
-      <w:pPr>
-        <w:pStyle w:val="ListBullet"/>
-        <w:spacing w:after="40"/>
-      </w:pPr>
-      <w:r>
-        <w:t>Each clip is sped up so that all end within 45 seconds; the label shows the speed (x2 = twice as fast) and PASS/FAIL.</w:t>
-      </w:r>
-    </w:p>
-    <w:p>
-      <w:pPr>
-        <w:pStyle w:val="ListBullet"/>
-        <w:spacing w:after="40"/>
-      </w:pPr>
-      <w:r>
-        <w:t>Each clip stops on its final screen. Orange labels mark the three failures.</w:t>
-      </w:r>
-    </w:p>
-    <w:p>
-      <w:pPr>
-        <w:spacing w:after="120"/>
-      </w:pPr>
-      <w:r>
-        <w:rPr>
-          <w:b/>
-        </w:rPr>
-        <w:t>Words on this slide</w:t>
-      </w:r>
-      <w:r>
-        <w:rPr>
-          <w:i w:val="0"/>
-        </w:rPr>
-      </w:r>
-    </w:p>
-    <w:p>
-      <w:pPr>
-        <w:pStyle w:val="ListBullet"/>
-        <w:spacing w:after="40"/>
-      </w:pPr>
-      <w:r>
-        <w:rPr>
-          <w:b/>
-        </w:rPr>
-        <w:t xml:space="preserve">Embedded video: </w:t>
-      </w:r>
-      <w:r>
-        <w:t>the video is inside the PowerPoint file; click it to play.</w:t>
-      </w:r>
-    </w:p>
-    <w:p>
-      <w:pPr>
-        <w:pStyle w:val="Heading2"/>
-      </w:pPr>
-      <w:r>
-        <w:t>Slide 16: Demo: one success, one failure</w:t>
-      </w:r>
-    </w:p>
-    <w:p>
-      <w:pPr>
-        <w:spacing w:after="120"/>
-      </w:pPr>
-      <w:r>
-        <w:rPr>
-          <w:b/>
-        </w:rPr>
-        <w:t xml:space="preserve">What it says. </w:t>
-      </w:r>
-      <w:r>
-        <w:rPr>
-          <w:i w:val="0"/>
-        </w:rPr>
-        <w:t>Markor seed 44 at 4x speed (PASS) and Files seed 43 at 3x speed (FAIL).</w:t>
-      </w:r>
-    </w:p>
-    <w:p>
-      <w:pPr>
-        <w:spacing w:after="120"/>
-      </w:pPr>
-      <w:r>
-        <w:rPr>
-          <w:b/>
-        </w:rPr>
-        <w:t>The data, and where it comes from</w:t>
-      </w:r>
-      <w:r>
-        <w:rPr>
-          <w:i w:val="0"/>
-        </w:rPr>
-      </w:r>
-    </w:p>
-    <w:p>
-      <w:pPr>
-        <w:pStyle w:val="ListBullet"/>
-        <w:spacing w:after="40"/>
-      </w:pPr>
-      <w:r>
-        <w:t>Watch the file names in the Files grid: they are cut off, and the agent picks a look-alike file.</w:t>
-      </w:r>
-    </w:p>
-    <w:p>
-      <w:pPr>
-        <w:pStyle w:val="Heading2"/>
-      </w:pPr>
-      <w:r>
-        <w:t>Slide 17: How 275 project runs ended</w:t>
-      </w:r>
-    </w:p>
-    <w:p>
-      <w:pPr>
-        <w:spacing w:after="120"/>
-      </w:pPr>
-      <w:r>
-        <w:rPr>
-          <w:b/>
-        </w:rPr>
-        <w:t xml:space="preserve">What it says. </w:t>
-      </w:r>
-      <w:r>
-        <w:rPr>
-          <w:i w:val="0"/>
-        </w:rPr>
-        <w:t>End reasons of all runs with a machine-readable summary, from the first tests to the final.</w:t>
-      </w:r>
-    </w:p>
-    <w:p>
-      <w:pPr>
-        <w:spacing w:after="120"/>
-      </w:pPr>
-      <w:r>
-        <w:rPr>
-          <w:b/>
-        </w:rPr>
-        <w:t>The data, and where it comes from</w:t>
-      </w:r>
-      <w:r>
-        <w:rPr>
-          <w:i w:val="0"/>
-        </w:rPr>
-      </w:r>
-    </w:p>
-    <w:p>
-      <w:pPr>
-        <w:pStyle w:val="ListBullet"/>
-        <w:spacing w:after="40"/>
-      </w:pPr>
-      <w:r>
-        <w:t>PASS 96; setup or other errors 60; no-progress stops 47; invalid replies 32; step budget used up 21; said done but verifier FAIL 19.</w:t>
-      </w:r>
-    </w:p>
-    <w:p>
-      <w:pPr>
-        <w:pStyle w:val="ListBullet"/>
-        <w:spacing w:after="40"/>
-      </w:pPr>
-      <w:r>
-        <w:t>Setup errors are the largest failure group: emulator, recorder or a crashed service, not the model.</w:t>
-      </w:r>
-    </w:p>
-    <w:p>
-      <w:pPr>
-        <w:pStyle w:val="ListBullet"/>
-        <w:spacing w:after="40"/>
-      </w:pPr>
-      <w:r>
-        <w:t>The card lists the five failure classes from D1 p.50, and the final evaluation's classes: false_done 1, grounding 1, other 1.</w:t>
-      </w:r>
-    </w:p>
-    <w:p>
-      <w:pPr>
-        <w:spacing w:after="120"/>
-      </w:pPr>
-      <w:r>
-        <w:rPr>
-          <w:b/>
-        </w:rPr>
-        <w:t>Words on this slide</w:t>
-      </w:r>
-      <w:r>
-        <w:rPr>
-          <w:i w:val="0"/>
-        </w:rPr>
-      </w:r>
-    </w:p>
-    <w:p>
-      <w:pPr>
-        <w:pStyle w:val="ListBullet"/>
-        <w:spacing w:after="40"/>
-      </w:pPr>
-      <w:r>
-        <w:rPr>
-          <w:b/>
-        </w:rPr>
-        <w:t xml:space="preserve">No-progress stop: </w:t>
-      </w:r>
-      <w:r>
-        <w:t>our rule stops a run when the same action repeats and the screen does not change.</w:t>
-      </w:r>
-    </w:p>
-    <w:p>
-      <w:pPr>
-        <w:pStyle w:val="ListBullet"/>
-        <w:spacing w:after="40"/>
-      </w:pPr>
-      <w:r>
-        <w:rPr>
-          <w:b/>
-        </w:rPr>
-        <w:t xml:space="preserve">Invalid reply: </w:t>
-      </w:r>
-      <w:r>
-        <w:t>two broken answers in one step end the run.</w:t>
-      </w:r>
-    </w:p>
-    <w:p>
-      <w:pPr>
-        <w:pStyle w:val="Heading2"/>
-      </w:pPr>
-      <w:r>
-        <w:t>Slide 18: Deep dive: Files, seed 43</w:t>
-      </w:r>
-    </w:p>
-    <w:p>
-      <w:pPr>
-        <w:spacing w:after="120"/>
-      </w:pPr>
-      <w:r>
-        <w:rPr>
-          <w:b/>
-        </w:rPr>
-        <w:t xml:space="preserve">What it says. </w:t>
-      </w:r>
-      <w:r>
-        <w:rPr>
-          <w:i w:val="0"/>
-        </w:rPr>
-        <w:t>Our main failure analysis. Task: move documentary.mp4 from Alarms to Movies.</w:t>
-      </w:r>
-    </w:p>
-    <w:p>
-      <w:pPr>
-        <w:spacing w:after="120"/>
-      </w:pPr>
-      <w:r>
-        <w:rPr>
-          <w:b/>
-        </w:rPr>
-        <w:t>The data, and where it comes from</w:t>
-      </w:r>
-      <w:r>
-        <w:rPr>
-          <w:i w:val="0"/>
-        </w:rPr>
-      </w:r>
-    </w:p>
-    <w:p>
-      <w:pPr>
-        <w:pStyle w:val="ListBullet"/>
-        <w:spacing w:after="40"/>
-      </w:pPr>
-      <w:r>
-        <w:t>Step 5: the Files grid shows cut-off names (“documentary_20…”). The model picked that file and wrote “…matches the required file documentary.mp4 (assuming it is named differently here)”, inventing the full name.</w:t>
-      </w:r>
-    </w:p>
-    <w:p>
-      <w:pPr>
-        <w:pStyle w:val="ListBullet"/>
-        <w:spacing w:after="40"/>
-      </w:pPr>
-      <w:r>
-        <w:t>Steps 6–11: correct moving steps, but on the wrong file. Steps 12–13: waited for “Moving 1 item” and finished.</w:t>
-      </w:r>
-    </w:p>
-    <w:p>
-      <w:pPr>
-        <w:pStyle w:val="ListBullet"/>
-        <w:spacing w:after="40"/>
-      </w:pPr>
-      <w:r>
-        <w:t>Verifier: FAIL, because documentary.mp4 never moved. Class: false_done; root cause: a look-alike chosen from a truncated name.</w:t>
-      </w:r>
-    </w:p>
-    <w:p>
-      <w:pPr>
-        <w:pStyle w:val="ListBullet"/>
-        <w:spacing w:after="40"/>
-      </w:pPr>
-      <w:r>
-        <w:t>Fix layers: instruction (use list view or search the exact name) and program (check the full name before Move).</w:t>
-      </w:r>
-    </w:p>
-    <w:p>
-      <w:pPr>
-        <w:spacing w:after="120"/>
-      </w:pPr>
-      <w:r>
-        <w:rPr>
-          <w:b/>
-        </w:rPr>
-        <w:t>Words on this slide</w:t>
-      </w:r>
-      <w:r>
-        <w:rPr>
-          <w:i w:val="0"/>
-        </w:rPr>
-      </w:r>
-    </w:p>
-    <w:p>
-      <w:pPr>
-        <w:pStyle w:val="ListBullet"/>
-        <w:spacing w:after="40"/>
-      </w:pPr>
-      <w:r>
-        <w:rPr>
-          <w:b/>
-        </w:rPr>
-        <w:t xml:space="preserve">Distractor files: </w:t>
-      </w:r>
-      <w:r>
-        <w:t>AndroidWorld adds files with similar names to make the task realistic.</w:t>
-      </w:r>
-    </w:p>
-    <w:p>
-      <w:pPr>
-        <w:pStyle w:val="Heading2"/>
-      </w:pPr>
-      <w:r>
-        <w:t>Slide 19: Two more failures, and why runs differ</w:t>
-      </w:r>
-    </w:p>
-    <w:p>
-      <w:pPr>
-        <w:spacing w:after="120"/>
-      </w:pPr>
-      <w:r>
-        <w:rPr>
-          <w:b/>
-        </w:rPr>
-        <w:t xml:space="preserve">What it says. </w:t>
-      </w:r>
-      <w:r>
-        <w:rPr>
-          <w:i w:val="0"/>
-        </w:rPr>
-        <w:t>Contacts seed 43 and OsmAnd seed 366, plus a table showing that the same task can pass on one run and fail on another.</w:t>
-      </w:r>
-    </w:p>
-    <w:p>
-      <w:pPr>
-        <w:spacing w:after="120"/>
-      </w:pPr>
-      <w:r>
-        <w:rPr>
-          <w:b/>
-        </w:rPr>
-        <w:t>The data, and where it comes from</w:t>
-      </w:r>
-      <w:r>
-        <w:rPr>
-          <w:i w:val="0"/>
-        </w:rPr>
-      </w:r>
-    </w:p>
-    <w:p>
-      <w:pPr>
-        <w:pStyle w:val="ListBullet"/>
-        <w:spacing w:after="40"/>
-      </w:pPr>
-      <w:r>
-        <w:t>Contacts s43: two swipes moved the form past the Phone field; four more swipes changed only the blinking cursor, and our own change check counted that as a change, so the model was told its swipe worked. Class: other (navigation).</w:t>
-      </w:r>
-    </w:p>
-    <w:p>
-      <w:pPr>
-        <w:pStyle w:val="ListBullet"/>
-        <w:spacing w:after="40"/>
-      </w:pPr>
-      <w:r>
-        <w:t>OsmAnd s366: our code said “Tap Clear at [941, 83]”; the model tapped [941, 57], the top edge of the button, three times. Class: grounding.</w:t>
-      </w:r>
-    </w:p>
-    <w:p>
-      <w:pPr>
-        <w:pStyle w:val="ListBullet"/>
-        <w:spacing w:after="40"/>
-      </w:pPr>
-      <w:r>
-        <w:t>Table: OsmAnd was 2/3 in two separate frozen evaluations (v61, v65) but a different run failed each time; Contacts seed 43 passed in v42 and failed in v65.</w:t>
-      </w:r>
-    </w:p>
-    <w:p>
-      <w:pPr>
-        <w:spacing w:after="120"/>
-      </w:pPr>
-      <w:r>
-        <w:rPr>
-          <w:b/>
-        </w:rPr>
-        <w:t xml:space="preserve">If someone asks: </w:t>
-      </w:r>
-      <w:r>
-        <w:rPr>
-          <w:i/>
-        </w:rPr>
-        <w:t>Did the agent get worse? Not necessarily: each run starts fresh, and long tasks give more chances for one small error.</w:t>
-      </w:r>
-    </w:p>
-    <w:p>
-      <w:pPr>
-        <w:pStyle w:val="Heading2"/>
-      </w:pPr>
-      <w:r>
-        <w:t>Slide 20: Test-setup problems</w:t>
-      </w:r>
-    </w:p>
-    <w:p>
-      <w:pPr>
-        <w:spacing w:after="120"/>
-      </w:pPr>
-      <w:r>
-        <w:rPr>
-          <w:b/>
-        </w:rPr>
-        <w:t xml:space="preserve">What it says. </w:t>
-      </w:r>
-      <w:r>
-        <w:rPr>
-          <w:i w:val="0"/>
-        </w:rPr>
-        <w:t>Problems that were not the model's fault, and their fixes.</w:t>
-      </w:r>
-    </w:p>
-    <w:p>
-      <w:pPr>
-        <w:spacing w:after="120"/>
-      </w:pPr>
-      <w:r>
-        <w:rPr>
-          <w:b/>
-        </w:rPr>
-        <w:t>The data, and where it comes from</w:t>
-      </w:r>
-      <w:r>
-        <w:rPr>
-          <w:i w:val="0"/>
-        </w:rPr>
-      </w:r>
-    </w:p>
-    <w:p>
-      <w:pPr>
-        <w:pStyle w:val="ListBullet"/>
-        <w:spacing w:after="40"/>
-      </w:pPr>
-      <w:r>
-        <w:t>Black screenshots (emulator graphics mode), recorder stopped (Android tools restarted their server), app start timeouts (5 s too short).</w:t>
-      </w:r>
-    </w:p>
-    <w:p>
-      <w:pPr>
-        <w:pStyle w:val="ListBullet"/>
-        <w:spacing w:after="40"/>
-      </w:pPr>
-      <w:r>
-        <w:t>“keeps stopping” dialog: AndroidWorld's accessibility service crashed in 11 of 25 OsmAnd runs from v49 on; the model closes it and the empty screen read is repeated.</w:t>
-      </w:r>
-    </w:p>
-    <w:p>
-      <w:pPr>
-        <w:pStyle w:val="ListBullet"/>
-        <w:spacing w:after="40"/>
-      </w:pPr>
-      <w:r>
-        <w:t>OsmAnd map missing: the Files task's initialization deletes shared storage; the runner now restores the map.</w:t>
-      </w:r>
-    </w:p>
-    <w:p>
-      <w:pPr>
-        <w:spacing w:after="120"/>
-      </w:pPr>
-      <w:r>
-        <w:rPr>
-          <w:b/>
-        </w:rPr>
-        <w:t>Words on this slide</w:t>
-      </w:r>
-      <w:r>
-        <w:rPr>
-          <w:i w:val="0"/>
-        </w:rPr>
-      </w:r>
-    </w:p>
-    <w:p>
-      <w:pPr>
-        <w:pStyle w:val="ListBullet"/>
-        <w:spacing w:after="40"/>
-      </w:pPr>
-      <w:r>
-        <w:rPr>
-          <w:b/>
-        </w:rPr>
-        <w:t xml:space="preserve">Harness: </w:t>
-      </w:r>
-      <w:r>
-        <w:t>everything around the model: emulator, recorder, runner, verifier.</w:t>
-      </w:r>
-    </w:p>
-    <w:p>
-      <w:pPr>
-        <w:pStyle w:val="Heading2"/>
-      </w:pPr>
-      <w:r>
-        <w:t>Slide 21: The hardest task: from zero passes to two of three</w:t>
-      </w:r>
-    </w:p>
-    <w:p>
-      <w:pPr>
-        <w:spacing w:after="120"/>
-      </w:pPr>
-      <w:r>
-        <w:rPr>
-          <w:b/>
-        </w:rPr>
-        <w:t xml:space="preserve">What it says. </w:t>
-      </w:r>
-      <w:r>
-        <w:rPr>
-          <w:i w:val="0"/>
-        </w:rPr>
-        <w:t>All OsmAnd runs grouped by version phase, with how many passed.</w:t>
-      </w:r>
-    </w:p>
-    <w:p>
-      <w:pPr>
-        <w:spacing w:after="120"/>
-      </w:pPr>
-      <w:r>
-        <w:rPr>
-          <w:b/>
-        </w:rPr>
-        <w:t>The data, and where it comes from</w:t>
-      </w:r>
-      <w:r>
-        <w:rPr>
-          <w:i w:val="0"/>
-        </w:rPr>
-      </w:r>
-    </w:p>
-    <w:p>
-      <w:pPr>
-        <w:pStyle w:val="ListBullet"/>
-        <w:spacing w:after="40"/>
-      </w:pPr>
-      <w:r>
-        <w:t>v30–v42 (Skill as text): 26 runs, 0 passed. v43–v48 (rules on the model's words): 10, 0. v49–v58 (reads the screen): 10, 0.</w:t>
-      </w:r>
-    </w:p>
-    <w:p>
-      <w:pPr>
-        <w:pStyle w:val="ListBullet"/>
-        <w:spacing w:after="40"/>
-      </w:pPr>
-      <w:r>
-        <w:t>v59–v62 (Skill as code): 11 runs, 5 passed. v63–v65 (final agent): 4 runs, 3 passed.</w:t>
-      </w:r>
-    </w:p>
-    <w:p>
-      <w:pPr>
-        <w:pStyle w:val="ListBullet"/>
-        <w:spacing w:after="40"/>
-      </w:pPr>
-      <w:r>
-        <w:t>So 46 runs without a pass, then 8 passes in the next 15. Fixes were tested on practice seeds, never on the evaluation seeds.</w:t>
-      </w:r>
-    </w:p>
-    <w:p>
-      <w:pPr>
-        <w:pStyle w:val="Heading2"/>
-      </w:pPr>
-      <w:r>
-        <w:t>Slide 22: Before and after</w:t>
-      </w:r>
-    </w:p>
-    <w:p>
-      <w:pPr>
-        <w:spacing w:after="120"/>
-      </w:pPr>
-      <w:r>
-        <w:rPr>
-          <w:b/>
-        </w:rPr>
-        <w:t xml:space="preserve">What it says. </w:t>
-      </w:r>
-      <w:r>
-        <w:rPr>
-          <w:i w:val="0"/>
-        </w:rPr>
-        <w:t>The documented improvement: same frozen code (v61), same seeds, same model; only the Skill on or off.</w:t>
-      </w:r>
-    </w:p>
-    <w:p>
-      <w:pPr>
-        <w:spacing w:after="120"/>
-      </w:pPr>
-      <w:r>
-        <w:rPr>
-          <w:b/>
-        </w:rPr>
-        <w:t>The data, and where it comes from</w:t>
-      </w:r>
-      <w:r>
-        <w:rPr>
-          <w:i w:val="0"/>
-        </w:rPr>
-      </w:r>
-    </w:p>
-    <w:p>
-      <w:pPr>
-        <w:pStyle w:val="ListBullet"/>
-        <w:spacing w:after="40"/>
-      </w:pPr>
-      <w:r>
-        <w:t>Verifier PASS 0/3 → 2/3; searched the place name only 0/3 → 3/3; route started with a searched place 0/3 → 2/3; saved a track 0/3 → 2/3; mean steps 23.3 → 18.7.</w:t>
-      </w:r>
-    </w:p>
-    <w:p>
-      <w:pPr>
-        <w:pStyle w:val="ListBullet"/>
-        <w:spacing w:after="40"/>
-      </w:pPr>
-      <w:r>
-        <w:t>Chart: text Skill only (v42, other seeds) 0; no Skill (v61) 0; Skill as code (v61) 2; final agent (v65) 2.</w:t>
-      </w:r>
-    </w:p>
-    <w:p>
-      <w:pPr>
-        <w:pStyle w:val="ListBullet"/>
-        <w:spacing w:after="40"/>
-      </w:pPr>
-      <w:r>
-        <w:t>Without the Skill the model typed “Ruggell, Liechtenstein” (finds only the country) and two runs used navigation, which never saves a track.</w:t>
-      </w:r>
-    </w:p>
-    <w:p>
-      <w:pPr>
-        <w:spacing w:after="120"/>
-      </w:pPr>
-      <w:r>
-        <w:rPr>
-          <w:b/>
-        </w:rPr>
-        <w:t xml:space="preserve">If someone asks: </w:t>
-      </w:r>
-      <w:r>
-        <w:rPr>
-          <w:i/>
-        </w:rPr>
-        <w:t>Is it fair? Only one setting changed, and both batches have the same source fingerprint. Three runs per side is still small.</w:t>
-      </w:r>
-    </w:p>
-    <w:p>
-      <w:pPr>
-        <w:pStyle w:val="Heading2"/>
-      </w:pPr>
-      <w:r>
-        <w:t>Slide 23: Lessons built into the final agent</w:t>
-      </w:r>
-    </w:p>
-    <w:p>
-      <w:pPr>
-        <w:spacing w:after="120"/>
-      </w:pPr>
-      <w:r>
-        <w:rPr>
-          <w:b/>
-        </w:rPr>
-        <w:t xml:space="preserve">What it says. </w:t>
-      </w:r>
-      <w:r>
-        <w:rPr>
-          <w:i w:val="0"/>
-        </w:rPr>
-        <w:t>Each failure we saw, its cause, the change, and the final result.</w:t>
-      </w:r>
-    </w:p>
-    <w:p>
-      <w:pPr>
-        <w:spacing w:after="120"/>
-      </w:pPr>
-      <w:r>
-        <w:rPr>
-          <w:b/>
-        </w:rPr>
-        <w:t>The data, and where it comes from</w:t>
-      </w:r>
-      <w:r>
-        <w:rPr>
-          <w:i w:val="0"/>
-        </w:rPr>
-      </w:r>
-    </w:p>
-    <w:p>
-      <w:pPr>
-        <w:pStyle w:val="ListBullet"/>
-        <w:spacing w:after="40"/>
-      </w:pPr>
-      <w:r>
-        <w:t>Markor “Not sent” → Markor Skill → Markor 3/3.</w:t>
-      </w:r>
-    </w:p>
-    <w:p>
-      <w:pPr>
-        <w:pStyle w:val="ListBullet"/>
-        <w:spacing w:after="40"/>
-      </w:pPr>
-      <w:r>
-        <w:t>Markor typing refused (custom editor) → focus check fixed → Markor 3/3.</w:t>
-      </w:r>
-    </w:p>
-    <w:p>
-      <w:pPr>
-        <w:pStyle w:val="ListBullet"/>
-        <w:spacing w:after="40"/>
-      </w:pPr>
-      <w:r>
-        <w:t>SMS app name in Chinese → alias table → Markor 3/3.</w:t>
-      </w:r>
-    </w:p>
-    <w:p>
-      <w:pPr>
-        <w:pStyle w:val="ListBullet"/>
-        <w:spacing w:after="40"/>
-      </w:pPr>
-      <w:r>
-        <w:t>OsmAnd map missing → map check plus official setup → OsmAnd 2/3.</w:t>
-      </w:r>
-    </w:p>
-    <w:p>
-      <w:pPr>
-        <w:pStyle w:val="ListBullet"/>
-        <w:spacing w:after="40"/>
-      </w:pPr>
-      <w:r>
-        <w:t>OsmAnd 0/3 → Skill as code plus GUI tree → OsmAnd 2/3.</w:t>
-      </w:r>
-    </w:p>
-    <w:p>
-      <w:pPr>
-        <w:pStyle w:val="ListBullet"/>
-        <w:spacing w:after="40"/>
-      </w:pPr>
-      <w:r>
-        <w:t>38 automatic offline tests; each fix has a test that fails on the old code and passes on the new code.</w:t>
-      </w:r>
-    </w:p>
-    <w:p>
-      <w:pPr>
-        <w:pStyle w:val="Heading2"/>
-      </w:pPr>
-      <w:r>
-        <w:t>Slide 24: Our work in numbers</w:t>
-      </w:r>
-    </w:p>
-    <w:p>
-      <w:pPr>
-        <w:spacing w:after="120"/>
-      </w:pPr>
-      <w:r>
-        <w:rPr>
-          <w:b/>
-        </w:rPr>
-        <w:t xml:space="preserve">What it says. </w:t>
-      </w:r>
-      <w:r>
-        <w:rPr>
-          <w:i w:val="0"/>
-        </w:rPr>
-        <w:t>Six numbers behind the result.</w:t>
-      </w:r>
-    </w:p>
-    <w:p>
-      <w:pPr>
-        <w:spacing w:after="120"/>
-      </w:pPr>
-      <w:r>
-        <w:rPr>
-          <w:b/>
-        </w:rPr>
-        <w:t>The data, and where it comes from</w:t>
-      </w:r>
-      <w:r>
-        <w:rPr>
-          <w:i w:val="0"/>
-        </w:rPr>
-      </w:r>
-    </w:p>
-    <w:p>
-      <w:pPr>
-        <w:pStyle w:val="ListBullet"/>
-        <w:spacing w:after="40"/>
-      </w:pPr>
-      <w:r>
-        <w:t>~300 recorded runs; 65 agent versions; 1,453 steps and 1,642 model calls in the runs of this agent's line on our machine; 38 offline tests; 0.48 € model cost of all those local runs.</w:t>
-      </w:r>
-    </w:p>
-    <w:p>
-      <w:pPr>
-        <w:pStyle w:val="Heading2"/>
-      </w:pPr>
-      <w:r>
-        <w:t>Slide 25: Findings and limitations</w:t>
-      </w:r>
-    </w:p>
-    <w:p>
-      <w:pPr>
-        <w:spacing w:after="120"/>
-      </w:pPr>
-      <w:r>
-        <w:rPr>
-          <w:b/>
-        </w:rPr>
-        <w:t xml:space="preserve">What it says. </w:t>
-      </w:r>
-      <w:r>
-        <w:rPr>
-          <w:i w:val="0"/>
-        </w:rPr>
-        <w:t>What we learned and what is still limited.</w:t>
-      </w:r>
-    </w:p>
-    <w:p>
-      <w:pPr>
-        <w:spacing w:after="120"/>
-      </w:pPr>
-      <w:r>
-        <w:rPr>
-          <w:b/>
-        </w:rPr>
-        <w:t>The data, and where it comes from</w:t>
-      </w:r>
-      <w:r>
-        <w:rPr>
-          <w:i w:val="0"/>
-        </w:rPr>
-      </w:r>
-    </w:p>
-    <w:p>
-      <w:pPr>
-        <w:pStyle w:val="ListBullet"/>
-        <w:spacing w:after="40"/>
-      </w:pPr>
-      <w:r>
-        <w:t>Findings: trust the harness first; the verifier decides; where knowledge lives matters (prompt &lt; reminder each step &lt; code); long tasks fail by small errors; checks catch traps (8 in the final runs).</w:t>
-      </w:r>
-    </w:p>
-    <w:p>
-      <w:pPr>
-        <w:pStyle w:val="ListBullet"/>
-        <w:spacing w:after="40"/>
-      </w:pPr>
-      <w:r>
-        <w:t>Limitations: three runs per task; one model, one laptop, one emulator; the OsmAnd Skill only works for OsmAnd; two tasks used extra screen labels; fixes after the freeze are not evaluated.</w:t>
-      </w:r>
-    </w:p>
-    <w:p>
-      <w:pPr>
-        <w:pStyle w:val="Heading2"/>
-      </w:pPr>
-      <w:r>
-        <w:t>Slide 26: Thank you</w:t>
-      </w:r>
-    </w:p>
-    <w:p>
-      <w:pPr>
-        <w:spacing w:after="120"/>
-      </w:pPr>
-      <w:r>
-        <w:rPr>
-          <w:b/>
-        </w:rPr>
-        <w:t xml:space="preserve">What it says. </w:t>
-      </w:r>
-      <w:r>
-        <w:rPr>
-          <w:i w:val="0"/>
-        </w:rPr>
-        <w:t>Repository, branch and tag, model and benchmark. The questions and short answers we prepared are in QA.md.</w:t>
       </w:r>
     </w:p>
     <w:sectPr>

</xml_diff>

<commit_message>
Presentation: demo slide compares two Files runs; Markor Q&A answer
Slide 16 now shows FilesMoveFile seed 42 (PASS) next to seed 43 (FAIL),
both at x3, so the success and the failure are the same task and the same
trap (look-alike files with cut-off names). Q&A gains an honest answer on
how the Markor run sends the SMS (types the text again; Share made an MMS)
and lists copy-paste as a next step. Briefing updated.

Co-Authored-By: Claude Opus 5.5 <noreply@anthropic.com>
</commit_message>
<xml_diff>
--- a/presentation/Team_Briefing_AndroidWorld_Agent.docx
+++ b/presentation/Team_Briefing_AndroidWorld_Agent.docx
@@ -5277,7 +5277,7 @@
         <w:pStyle w:val="Heading2"/>
       </w:pPr>
       <w:r>
-        <w:t>Slide 16: Demo: one success, one failure</w:t>
+        <w:t>Slide 16: Demo: same task, one success, one failure</w:t>
       </w:r>
     </w:p>
     <w:p>
@@ -5294,7 +5294,7 @@
         <w:rPr>
           <w:i w:val="0"/>
         </w:rPr>
-        <w:t>Markor seed 44 at 4x speed (PASS) and Files seed 43 at 3x speed (FAIL).</w:t>
+        <w:t>Two runs of FilesMoveFile, both at 3x speed: seed 42 (PASS, 17 steps) and seed 43 (FAIL, 13 steps).</w:t>
       </w:r>
     </w:p>
     <w:p>
@@ -5319,7 +5319,42 @@
         <w:spacing w:after="40"/>
       </w:pPr>
       <w:r>
-        <w:t>Watch the file names in the Files grid: they are cut off, and the agent picks a look-alike file.</w:t>
+        <w:t>Both folders contain look-alike files whose names are cut off in the grid (for example “IZM1_sci_fi_boo…” next to sci_fi_book.mp3).</w:t>
+      </w:r>
+    </w:p>
+    <w:p>
+      <w:pPr>
+        <w:pStyle w:val="ListBullet"/>
+        <w:spacing w:after="40"/>
+      </w:pPr>
+      <w:r>
+        <w:t>Seed 42: the agent scrolled until the full name sci_fi_book.mp3 was visible, moved exactly that file, then opened Audiobooks to check before finishing (the log shows this check; the video ends while it is on the way there).</w:t>
+      </w:r>
+    </w:p>
+    <w:p>
+      <w:pPr>
+        <w:pStyle w:val="ListBullet"/>
+        <w:spacing w:after="40"/>
+      </w:pPr>
+      <w:r>
+        <w:t>Seed 43: the agent picked “documentary_20…”, a look-alike, moved it and said done. Slide 18 analyses this run.</w:t>
+      </w:r>
+    </w:p>
+    <w:p>
+      <w:pPr>
+        <w:spacing w:after="120"/>
+      </w:pPr>
+      <w:r>
+        <w:rPr>
+          <w:b/>
+        </w:rPr>
+        <w:t xml:space="preserve">If someone asks: </w:t>
+      </w:r>
+      <w:r>
+        <w:rPr>
+          <w:i/>
+        </w:rPr>
+        <w:t>Why not show Markor here? We kept the demo on one task so the success and the failure can be compared directly. Markor is still in the results and the run log; how it sends the SMS (it types the text again) and why is answered in QA.md, Q9.</w:t>
       </w:r>
     </w:p>
     <w:p>

</xml_diff>

<commit_message>
Presentation: correct statements made outdated by the v66 follow-up
Q&A Q9 now reports the v66 result (Share > Plain Text, all three runs
shared the note, 2/3 passed, one grounding miss) instead of "not tested
yet"; the copy step is removed from the next steps; slide 25's limitation
and the matching briefing lines no longer say that no fix after the freeze
was evaluated. Results tables and demos are unchanged.

Co-Authored-By: Claude Opus 5.5 <noreply@anthropic.com>
</commit_message>
<xml_diff>
--- a/presentation/Team_Briefing_AndroidWorld_Agent.docx
+++ b/presentation/Team_Briefing_AndroidWorld_Agent.docx
@@ -5418,7 +5418,7 @@
         <w:rPr>
           <w:i/>
         </w:rPr>
-        <w:t>Why not show Markor here? We kept the demo on one task so the success and the failure can be compared directly. Markor is still in the results and the run log; how it sends the SMS (it types the text again) and why is answered in QA.md, Q9.</w:t>
+        <w:t>Why not show Markor here? We kept the demo on one task so the success and the failure can be compared directly. Markor is still in the results and the run log; how it sends the SMS (in v65 it types the text again; the v66 follow-up shares the note) is answered in QA.md, Q9.</w:t>
       </w:r>
     </w:p>
     <w:p>
@@ -6181,7 +6181,7 @@
         <w:spacing w:after="40"/>
       </w:pPr>
       <w:r>
-        <w:t>Limitations: three runs per task; one model, one laptop, one emulator; the OsmAnd Skill only works for OsmAnd; two tasks used extra screen labels; fixes after the freeze are not evaluated.</w:t>
+        <w:t>Limitations: three runs per task; one model, one laptop, one emulator; the OsmAnd Skill only works for OsmAnd; two tasks used extra screen labels; after the freeze only the Markor fix was re-run (v66: Share &gt; Plain Text, 2/3, see docs/MARKOR_SHARE_V66.md).</w:t>
       </w:r>
     </w:p>
     <w:p>

</xml_diff>